<commit_message>
Update API full reference
</commit_message>
<xml_diff>
--- a/Reference/DeviceIdentifier-API-FullReference.docx
+++ b/Reference/DeviceIdentifier-API-FullReference.docx
@@ -647,25 +647,21 @@
     </w:p>
     <w:p>
       <w:pPr>
-        <w:pStyle w:val="Heading1"/>
-        <w:rPr>
-          <w:noProof/>
-          <w:color w:val="000000" w:themeColor="text1"/>
+        <w:pStyle w:val="TOCHeading"/>
+        <w:rPr>
+          <w:noProof/>
           <w:lang w:val="en-MY"/>
         </w:rPr>
       </w:pPr>
-      <w:bookmarkStart w:id="1" w:name="_Toc240036214"/>
       <w:r>
         <w:rPr>
           <w:noProof/>
-          <w:color w:val="000000" w:themeColor="text1"/>
           <w:lang w:val="en-MY"/>
         </w:rPr>
         <w:lastRenderedPageBreak/>
         <w:t>Contents</w:t>
       </w:r>
       <w:bookmarkEnd w:id="0"/>
-      <w:bookmarkEnd w:id="1"/>
     </w:p>
     <w:p>
       <w:pPr>
@@ -704,89 +700,7 @@
         </w:rPr>
         <w:fldChar w:fldCharType="separate"/>
       </w:r>
-      <w:hyperlink w:anchor="_Toc240036214" w:history="1">
-        <w:r>
-          <w:rPr>
-            <w:rStyle w:val="Hyperlink"/>
-            <w:noProof/>
-            <w:lang w:val="en-MY"/>
-          </w:rPr>
-          <w:t>Contents</w:t>
-        </w:r>
-        <w:r>
-          <w:rPr>
-            <w:noProof/>
-            <w:webHidden/>
-            <w:lang w:val="en-MY"/>
-          </w:rPr>
-          <w:tab/>
-        </w:r>
-        <w:r>
-          <w:rPr>
-            <w:noProof/>
-            <w:webHidden/>
-            <w:lang w:val="en-MY"/>
-          </w:rPr>
-          <w:fldChar w:fldCharType="begin"/>
-        </w:r>
-        <w:r>
-          <w:rPr>
-            <w:noProof/>
-            <w:webHidden/>
-            <w:lang w:val="en-MY"/>
-          </w:rPr>
-          <w:instrText xml:space="preserve"> PAGEREF _Toc240036214 \h </w:instrText>
-        </w:r>
-        <w:r>
-          <w:rPr>
-            <w:noProof/>
-            <w:webHidden/>
-            <w:lang w:val="en-MY"/>
-          </w:rPr>
-        </w:r>
-        <w:r>
-          <w:rPr>
-            <w:noProof/>
-            <w:webHidden/>
-            <w:lang w:val="en-MY"/>
-          </w:rPr>
-          <w:fldChar w:fldCharType="separate"/>
-        </w:r>
-        <w:r>
-          <w:rPr>
-            <w:noProof/>
-            <w:webHidden/>
-            <w:lang w:val="en-MY"/>
-          </w:rPr>
-          <w:t>3</w:t>
-        </w:r>
-        <w:r>
-          <w:rPr>
-            <w:noProof/>
-            <w:webHidden/>
-            <w:lang w:val="en-MY"/>
-          </w:rPr>
-          <w:fldChar w:fldCharType="end"/>
-        </w:r>
-      </w:hyperlink>
-    </w:p>
-    <w:p>
-      <w:pPr>
-        <w:pStyle w:val="TOC1"/>
-        <w:tabs>
-          <w:tab w:val="right" w:leader="dot" w:pos="9350"/>
-        </w:tabs>
-        <w:rPr>
-          <w:rFonts w:asciiTheme="minorHAnsi" w:hAnsiTheme="minorHAnsi"/>
-          <w:noProof/>
-          <w:kern w:val="2"/>
-          <w:sz w:val="24"/>
-          <w:szCs w:val="24"/>
-          <w:lang w:val="en-MY" w:eastAsia="en-MY"/>
-          <w14:ligatures w14:val="standardContextual"/>
-        </w:rPr>
-      </w:pPr>
-      <w:hyperlink w:anchor="_Toc240036215" w:history="1">
+      <w:hyperlink w:anchor="_Toc240537812" w:history="1">
         <w:r>
           <w:rPr>
             <w:rStyle w:val="Hyperlink"/>
@@ -799,7 +713,6 @@
           <w:rPr>
             <w:noProof/>
             <w:webHidden/>
-            <w:lang w:val="en-MY"/>
           </w:rPr>
           <w:tab/>
         </w:r>
@@ -807,7 +720,6 @@
           <w:rPr>
             <w:noProof/>
             <w:webHidden/>
-            <w:lang w:val="en-MY"/>
           </w:rPr>
           <w:fldChar w:fldCharType="begin"/>
         </w:r>
@@ -815,22 +727,19 @@
           <w:rPr>
             <w:noProof/>
             <w:webHidden/>
-            <w:lang w:val="en-MY"/>
           </w:rPr>
-          <w:instrText xml:space="preserve"> PAGEREF _Toc240036215 \h </w:instrText>
+          <w:instrText xml:space="preserve"> PAGEREF _Toc240537812 \h </w:instrText>
         </w:r>
         <w:r>
           <w:rPr>
             <w:noProof/>
             <w:webHidden/>
-            <w:lang w:val="en-MY"/>
           </w:rPr>
         </w:r>
         <w:r>
           <w:rPr>
             <w:noProof/>
             <w:webHidden/>
-            <w:lang w:val="en-MY"/>
           </w:rPr>
           <w:fldChar w:fldCharType="separate"/>
         </w:r>
@@ -838,7 +747,6 @@
           <w:rPr>
             <w:noProof/>
             <w:webHidden/>
-            <w:lang w:val="en-MY"/>
           </w:rPr>
           <w:t>5</w:t>
         </w:r>
@@ -846,7 +754,6 @@
           <w:rPr>
             <w:noProof/>
             <w:webHidden/>
-            <w:lang w:val="en-MY"/>
           </w:rPr>
           <w:fldChar w:fldCharType="end"/>
         </w:r>
@@ -868,7 +775,7 @@
           <w14:ligatures w14:val="standardContextual"/>
         </w:rPr>
       </w:pPr>
-      <w:hyperlink w:anchor="_Toc240036216" w:history="1">
+      <w:hyperlink w:anchor="_Toc240537813" w:history="1">
         <w:r>
           <w:rPr>
             <w:rStyle w:val="Hyperlink"/>
@@ -881,7 +788,6 @@
           <w:rPr>
             <w:noProof/>
             <w:webHidden/>
-            <w:lang w:val="en-MY"/>
           </w:rPr>
           <w:tab/>
         </w:r>
@@ -889,7 +795,6 @@
           <w:rPr>
             <w:noProof/>
             <w:webHidden/>
-            <w:lang w:val="en-MY"/>
           </w:rPr>
           <w:fldChar w:fldCharType="begin"/>
         </w:r>
@@ -897,22 +802,19 @@
           <w:rPr>
             <w:noProof/>
             <w:webHidden/>
-            <w:lang w:val="en-MY"/>
           </w:rPr>
-          <w:instrText xml:space="preserve"> PAGEREF _Toc240036216 \h </w:instrText>
+          <w:instrText xml:space="preserve"> PAGEREF _Toc240537813 \h </w:instrText>
         </w:r>
         <w:r>
           <w:rPr>
             <w:noProof/>
             <w:webHidden/>
-            <w:lang w:val="en-MY"/>
           </w:rPr>
         </w:r>
         <w:r>
           <w:rPr>
             <w:noProof/>
             <w:webHidden/>
-            <w:lang w:val="en-MY"/>
           </w:rPr>
           <w:fldChar w:fldCharType="separate"/>
         </w:r>
@@ -920,7 +822,6 @@
           <w:rPr>
             <w:noProof/>
             <w:webHidden/>
-            <w:lang w:val="en-MY"/>
           </w:rPr>
           <w:t>6</w:t>
         </w:r>
@@ -928,7 +829,6 @@
           <w:rPr>
             <w:noProof/>
             <w:webHidden/>
-            <w:lang w:val="en-MY"/>
           </w:rPr>
           <w:fldChar w:fldCharType="end"/>
         </w:r>
@@ -950,20 +850,19 @@
           <w14:ligatures w14:val="standardContextual"/>
         </w:rPr>
       </w:pPr>
-      <w:hyperlink w:anchor="_Toc240036217" w:history="1">
+      <w:hyperlink w:anchor="_Toc240537814" w:history="1">
         <w:r>
           <w:rPr>
             <w:rStyle w:val="Hyperlink"/>
             <w:noProof/>
             <w:lang w:val="en-MY"/>
           </w:rPr>
-          <w:t>1.1 The two class libraries</w:t>
+          <w:t>1.1 Class libraries</w:t>
         </w:r>
         <w:r>
           <w:rPr>
             <w:noProof/>
             <w:webHidden/>
-            <w:lang w:val="en-MY"/>
           </w:rPr>
           <w:tab/>
         </w:r>
@@ -971,7 +870,6 @@
           <w:rPr>
             <w:noProof/>
             <w:webHidden/>
-            <w:lang w:val="en-MY"/>
           </w:rPr>
           <w:fldChar w:fldCharType="begin"/>
         </w:r>
@@ -979,22 +877,19 @@
           <w:rPr>
             <w:noProof/>
             <w:webHidden/>
-            <w:lang w:val="en-MY"/>
           </w:rPr>
-          <w:instrText xml:space="preserve"> PAGEREF _Toc240036217 \h </w:instrText>
+          <w:instrText xml:space="preserve"> PAGEREF _Toc240537814 \h </w:instrText>
         </w:r>
         <w:r>
           <w:rPr>
             <w:noProof/>
             <w:webHidden/>
-            <w:lang w:val="en-MY"/>
           </w:rPr>
         </w:r>
         <w:r>
           <w:rPr>
             <w:noProof/>
             <w:webHidden/>
-            <w:lang w:val="en-MY"/>
           </w:rPr>
           <w:fldChar w:fldCharType="separate"/>
         </w:r>
@@ -1002,7 +897,6 @@
           <w:rPr>
             <w:noProof/>
             <w:webHidden/>
-            <w:lang w:val="en-MY"/>
           </w:rPr>
           <w:t>6</w:t>
         </w:r>
@@ -1010,7 +904,6 @@
           <w:rPr>
             <w:noProof/>
             <w:webHidden/>
-            <w:lang w:val="en-MY"/>
           </w:rPr>
           <w:fldChar w:fldCharType="end"/>
         </w:r>
@@ -1032,20 +925,19 @@
           <w14:ligatures w14:val="standardContextual"/>
         </w:rPr>
       </w:pPr>
-      <w:hyperlink w:anchor="_Toc240036218" w:history="1">
+      <w:hyperlink w:anchor="_Toc240537815" w:history="1">
         <w:r>
           <w:rPr>
             <w:rStyle w:val="Hyperlink"/>
             <w:noProof/>
             <w:lang w:val="en-MY"/>
           </w:rPr>
-          <w:t>1.2 How many classes in each library</w:t>
+          <w:t>1.2 Total classes in each library</w:t>
         </w:r>
         <w:r>
           <w:rPr>
             <w:noProof/>
             <w:webHidden/>
-            <w:lang w:val="en-MY"/>
           </w:rPr>
           <w:tab/>
         </w:r>
@@ -1053,7 +945,6 @@
           <w:rPr>
             <w:noProof/>
             <w:webHidden/>
-            <w:lang w:val="en-MY"/>
           </w:rPr>
           <w:fldChar w:fldCharType="begin"/>
         </w:r>
@@ -1061,22 +952,19 @@
           <w:rPr>
             <w:noProof/>
             <w:webHidden/>
-            <w:lang w:val="en-MY"/>
           </w:rPr>
-          <w:instrText xml:space="preserve"> PAGEREF _Toc240036218 \h </w:instrText>
+          <w:instrText xml:space="preserve"> PAGEREF _Toc240537815 \h </w:instrText>
         </w:r>
         <w:r>
           <w:rPr>
             <w:noProof/>
             <w:webHidden/>
-            <w:lang w:val="en-MY"/>
           </w:rPr>
         </w:r>
         <w:r>
           <w:rPr>
             <w:noProof/>
             <w:webHidden/>
-            <w:lang w:val="en-MY"/>
           </w:rPr>
           <w:fldChar w:fldCharType="separate"/>
         </w:r>
@@ -1084,7 +972,6 @@
           <w:rPr>
             <w:noProof/>
             <w:webHidden/>
-            <w:lang w:val="en-MY"/>
           </w:rPr>
           <w:t>6</w:t>
         </w:r>
@@ -1092,7 +979,6 @@
           <w:rPr>
             <w:noProof/>
             <w:webHidden/>
-            <w:lang w:val="en-MY"/>
           </w:rPr>
           <w:fldChar w:fldCharType="end"/>
         </w:r>
@@ -1114,7 +1000,7 @@
           <w14:ligatures w14:val="standardContextual"/>
         </w:rPr>
       </w:pPr>
-      <w:hyperlink w:anchor="_Toc240036219" w:history="1">
+      <w:hyperlink w:anchor="_Toc240537816" w:history="1">
         <w:r>
           <w:rPr>
             <w:rStyle w:val="Hyperlink"/>
@@ -1127,7 +1013,6 @@
           <w:rPr>
             <w:noProof/>
             <w:webHidden/>
-            <w:lang w:val="en-MY"/>
           </w:rPr>
           <w:tab/>
         </w:r>
@@ -1135,7 +1020,6 @@
           <w:rPr>
             <w:noProof/>
             <w:webHidden/>
-            <w:lang w:val="en-MY"/>
           </w:rPr>
           <w:fldChar w:fldCharType="begin"/>
         </w:r>
@@ -1143,22 +1027,19 @@
           <w:rPr>
             <w:noProof/>
             <w:webHidden/>
-            <w:lang w:val="en-MY"/>
           </w:rPr>
-          <w:instrText xml:space="preserve"> PAGEREF _Toc240036219 \h </w:instrText>
+          <w:instrText xml:space="preserve"> PAGEREF _Toc240537816 \h </w:instrText>
         </w:r>
         <w:r>
           <w:rPr>
             <w:noProof/>
             <w:webHidden/>
-            <w:lang w:val="en-MY"/>
           </w:rPr>
         </w:r>
         <w:r>
           <w:rPr>
             <w:noProof/>
             <w:webHidden/>
-            <w:lang w:val="en-MY"/>
           </w:rPr>
           <w:fldChar w:fldCharType="separate"/>
         </w:r>
@@ -1166,7 +1047,6 @@
           <w:rPr>
             <w:noProof/>
             <w:webHidden/>
-            <w:lang w:val="en-MY"/>
           </w:rPr>
           <w:t>6</w:t>
         </w:r>
@@ -1174,7 +1054,6 @@
           <w:rPr>
             <w:noProof/>
             <w:webHidden/>
-            <w:lang w:val="en-MY"/>
           </w:rPr>
           <w:fldChar w:fldCharType="end"/>
         </w:r>
@@ -1196,7 +1075,7 @@
           <w14:ligatures w14:val="standardContextual"/>
         </w:rPr>
       </w:pPr>
-      <w:hyperlink w:anchor="_Toc240036220" w:history="1">
+      <w:hyperlink w:anchor="_Toc240537817" w:history="1">
         <w:r>
           <w:rPr>
             <w:rStyle w:val="Hyperlink"/>
@@ -1209,7 +1088,6 @@
           <w:rPr>
             <w:noProof/>
             <w:webHidden/>
-            <w:lang w:val="en-MY"/>
           </w:rPr>
           <w:tab/>
         </w:r>
@@ -1217,7 +1095,6 @@
           <w:rPr>
             <w:noProof/>
             <w:webHidden/>
-            <w:lang w:val="en-MY"/>
           </w:rPr>
           <w:fldChar w:fldCharType="begin"/>
         </w:r>
@@ -1225,22 +1102,19 @@
           <w:rPr>
             <w:noProof/>
             <w:webHidden/>
-            <w:lang w:val="en-MY"/>
           </w:rPr>
-          <w:instrText xml:space="preserve"> PAGEREF _Toc240036220 \h </w:instrText>
+          <w:instrText xml:space="preserve"> PAGEREF _Toc240537817 \h </w:instrText>
         </w:r>
         <w:r>
           <w:rPr>
             <w:noProof/>
             <w:webHidden/>
-            <w:lang w:val="en-MY"/>
           </w:rPr>
         </w:r>
         <w:r>
           <w:rPr>
             <w:noProof/>
             <w:webHidden/>
-            <w:lang w:val="en-MY"/>
           </w:rPr>
           <w:fldChar w:fldCharType="separate"/>
         </w:r>
@@ -1248,7 +1122,6 @@
           <w:rPr>
             <w:noProof/>
             <w:webHidden/>
-            <w:lang w:val="en-MY"/>
           </w:rPr>
           <w:t>7</w:t>
         </w:r>
@@ -1256,7 +1129,6 @@
           <w:rPr>
             <w:noProof/>
             <w:webHidden/>
-            <w:lang w:val="en-MY"/>
           </w:rPr>
           <w:fldChar w:fldCharType="end"/>
         </w:r>
@@ -1278,7 +1150,7 @@
           <w14:ligatures w14:val="standardContextual"/>
         </w:rPr>
       </w:pPr>
-      <w:hyperlink w:anchor="_Toc240036221" w:history="1">
+      <w:hyperlink w:anchor="_Toc240537818" w:history="1">
         <w:r>
           <w:rPr>
             <w:rStyle w:val="Hyperlink"/>
@@ -1291,7 +1163,6 @@
           <w:rPr>
             <w:noProof/>
             <w:webHidden/>
-            <w:lang w:val="en-MY"/>
           </w:rPr>
           <w:tab/>
         </w:r>
@@ -1299,7 +1170,6 @@
           <w:rPr>
             <w:noProof/>
             <w:webHidden/>
-            <w:lang w:val="en-MY"/>
           </w:rPr>
           <w:fldChar w:fldCharType="begin"/>
         </w:r>
@@ -1307,22 +1177,19 @@
           <w:rPr>
             <w:noProof/>
             <w:webHidden/>
-            <w:lang w:val="en-MY"/>
           </w:rPr>
-          <w:instrText xml:space="preserve"> PAGEREF _Toc240036221 \h </w:instrText>
+          <w:instrText xml:space="preserve"> PAGEREF _Toc240537818 \h </w:instrText>
         </w:r>
         <w:r>
           <w:rPr>
             <w:noProof/>
             <w:webHidden/>
-            <w:lang w:val="en-MY"/>
           </w:rPr>
         </w:r>
         <w:r>
           <w:rPr>
             <w:noProof/>
             <w:webHidden/>
-            <w:lang w:val="en-MY"/>
           </w:rPr>
           <w:fldChar w:fldCharType="separate"/>
         </w:r>
@@ -1330,7 +1197,6 @@
           <w:rPr>
             <w:noProof/>
             <w:webHidden/>
-            <w:lang w:val="en-MY"/>
           </w:rPr>
           <w:t>7</w:t>
         </w:r>
@@ -1338,7 +1204,6 @@
           <w:rPr>
             <w:noProof/>
             <w:webHidden/>
-            <w:lang w:val="en-MY"/>
           </w:rPr>
           <w:fldChar w:fldCharType="end"/>
         </w:r>
@@ -1360,20 +1225,19 @@
           <w14:ligatures w14:val="standardContextual"/>
         </w:rPr>
       </w:pPr>
-      <w:hyperlink w:anchor="_Toc240036222" w:history="1">
+      <w:hyperlink w:anchor="_Toc240537819" w:history="1">
         <w:r>
           <w:rPr>
             <w:rStyle w:val="Hyperlink"/>
             <w:noProof/>
             <w:lang w:val="en-MY"/>
           </w:rPr>
-          <w:t>1.6 Who needs which section</w:t>
+          <w:t>1.6 Section Guide by User Role</w:t>
         </w:r>
         <w:r>
           <w:rPr>
             <w:noProof/>
             <w:webHidden/>
-            <w:lang w:val="en-MY"/>
           </w:rPr>
           <w:tab/>
         </w:r>
@@ -1381,7 +1245,6 @@
           <w:rPr>
             <w:noProof/>
             <w:webHidden/>
-            <w:lang w:val="en-MY"/>
           </w:rPr>
           <w:fldChar w:fldCharType="begin"/>
         </w:r>
@@ -1389,22 +1252,19 @@
           <w:rPr>
             <w:noProof/>
             <w:webHidden/>
-            <w:lang w:val="en-MY"/>
           </w:rPr>
-          <w:instrText xml:space="preserve"> PAGEREF _Toc240036222 \h </w:instrText>
+          <w:instrText xml:space="preserve"> PAGEREF _Toc240537819 \h </w:instrText>
         </w:r>
         <w:r>
           <w:rPr>
             <w:noProof/>
             <w:webHidden/>
-            <w:lang w:val="en-MY"/>
           </w:rPr>
         </w:r>
         <w:r>
           <w:rPr>
             <w:noProof/>
             <w:webHidden/>
-            <w:lang w:val="en-MY"/>
           </w:rPr>
           <w:fldChar w:fldCharType="separate"/>
         </w:r>
@@ -1412,7 +1272,6 @@
           <w:rPr>
             <w:noProof/>
             <w:webHidden/>
-            <w:lang w:val="en-MY"/>
           </w:rPr>
           <w:t>7</w:t>
         </w:r>
@@ -1420,7 +1279,6 @@
           <w:rPr>
             <w:noProof/>
             <w:webHidden/>
-            <w:lang w:val="en-MY"/>
           </w:rPr>
           <w:fldChar w:fldCharType="end"/>
         </w:r>
@@ -1442,7 +1300,7 @@
           <w14:ligatures w14:val="standardContextual"/>
         </w:rPr>
       </w:pPr>
-      <w:hyperlink w:anchor="_Toc240036223" w:history="1">
+      <w:hyperlink w:anchor="_Toc240537820" w:history="1">
         <w:r>
           <w:rPr>
             <w:rStyle w:val="Hyperlink"/>
@@ -1455,7 +1313,6 @@
           <w:rPr>
             <w:noProof/>
             <w:webHidden/>
-            <w:lang w:val="en-MY"/>
           </w:rPr>
           <w:tab/>
         </w:r>
@@ -1463,7 +1320,6 @@
           <w:rPr>
             <w:noProof/>
             <w:webHidden/>
-            <w:lang w:val="en-MY"/>
           </w:rPr>
           <w:fldChar w:fldCharType="begin"/>
         </w:r>
@@ -1471,22 +1327,19 @@
           <w:rPr>
             <w:noProof/>
             <w:webHidden/>
-            <w:lang w:val="en-MY"/>
           </w:rPr>
-          <w:instrText xml:space="preserve"> PAGEREF _Toc240036223 \h </w:instrText>
+          <w:instrText xml:space="preserve"> PAGEREF _Toc240537820 \h </w:instrText>
         </w:r>
         <w:r>
           <w:rPr>
             <w:noProof/>
             <w:webHidden/>
-            <w:lang w:val="en-MY"/>
           </w:rPr>
         </w:r>
         <w:r>
           <w:rPr>
             <w:noProof/>
             <w:webHidden/>
-            <w:lang w:val="en-MY"/>
           </w:rPr>
           <w:fldChar w:fldCharType="separate"/>
         </w:r>
@@ -1494,7 +1347,6 @@
           <w:rPr>
             <w:noProof/>
             <w:webHidden/>
-            <w:lang w:val="en-MY"/>
           </w:rPr>
           <w:t>8</w:t>
         </w:r>
@@ -1502,7 +1354,6 @@
           <w:rPr>
             <w:noProof/>
             <w:webHidden/>
-            <w:lang w:val="en-MY"/>
           </w:rPr>
           <w:fldChar w:fldCharType="end"/>
         </w:r>
@@ -1524,20 +1375,19 @@
           <w14:ligatures w14:val="standardContextual"/>
         </w:rPr>
       </w:pPr>
-      <w:hyperlink w:anchor="_Toc240036224" w:history="1">
+      <w:hyperlink w:anchor="_Toc240537821" w:history="1">
         <w:r>
           <w:rPr>
             <w:rStyle w:val="Hyperlink"/>
             <w:noProof/>
             <w:lang w:val="en-MY"/>
           </w:rPr>
-          <w:t>2.1 What the system produces for the user</w:t>
+          <w:t>2.1 System Output</w:t>
         </w:r>
         <w:r>
           <w:rPr>
             <w:noProof/>
             <w:webHidden/>
-            <w:lang w:val="en-MY"/>
           </w:rPr>
           <w:tab/>
         </w:r>
@@ -1545,7 +1395,6 @@
           <w:rPr>
             <w:noProof/>
             <w:webHidden/>
-            <w:lang w:val="en-MY"/>
           </w:rPr>
           <w:fldChar w:fldCharType="begin"/>
         </w:r>
@@ -1553,22 +1402,19 @@
           <w:rPr>
             <w:noProof/>
             <w:webHidden/>
-            <w:lang w:val="en-MY"/>
           </w:rPr>
-          <w:instrText xml:space="preserve"> PAGEREF _Toc240036224 \h </w:instrText>
+          <w:instrText xml:space="preserve"> PAGEREF _Toc240537821 \h </w:instrText>
         </w:r>
         <w:r>
           <w:rPr>
             <w:noProof/>
             <w:webHidden/>
-            <w:lang w:val="en-MY"/>
           </w:rPr>
         </w:r>
         <w:r>
           <w:rPr>
             <w:noProof/>
             <w:webHidden/>
-            <w:lang w:val="en-MY"/>
           </w:rPr>
           <w:fldChar w:fldCharType="separate"/>
         </w:r>
@@ -1576,7 +1422,6 @@
           <w:rPr>
             <w:noProof/>
             <w:webHidden/>
-            <w:lang w:val="en-MY"/>
           </w:rPr>
           <w:t>8</w:t>
         </w:r>
@@ -1584,7 +1429,6 @@
           <w:rPr>
             <w:noProof/>
             <w:webHidden/>
-            <w:lang w:val="en-MY"/>
           </w:rPr>
           <w:fldChar w:fldCharType="end"/>
         </w:r>
@@ -1606,7 +1450,7 @@
           <w14:ligatures w14:val="standardContextual"/>
         </w:rPr>
       </w:pPr>
-      <w:hyperlink w:anchor="_Toc240036225" w:history="1">
+      <w:hyperlink w:anchor="_Toc240537822" w:history="1">
         <w:r>
           <w:rPr>
             <w:rStyle w:val="Hyperlink"/>
@@ -1619,7 +1463,6 @@
           <w:rPr>
             <w:noProof/>
             <w:webHidden/>
-            <w:lang w:val="en-MY"/>
           </w:rPr>
           <w:tab/>
         </w:r>
@@ -1627,7 +1470,6 @@
           <w:rPr>
             <w:noProof/>
             <w:webHidden/>
-            <w:lang w:val="en-MY"/>
           </w:rPr>
           <w:fldChar w:fldCharType="begin"/>
         </w:r>
@@ -1635,22 +1477,19 @@
           <w:rPr>
             <w:noProof/>
             <w:webHidden/>
-            <w:lang w:val="en-MY"/>
           </w:rPr>
-          <w:instrText xml:space="preserve"> PAGEREF _Toc240036225 \h </w:instrText>
+          <w:instrText xml:space="preserve"> PAGEREF _Toc240537822 \h </w:instrText>
         </w:r>
         <w:r>
           <w:rPr>
             <w:noProof/>
             <w:webHidden/>
-            <w:lang w:val="en-MY"/>
           </w:rPr>
         </w:r>
         <w:r>
           <w:rPr>
             <w:noProof/>
             <w:webHidden/>
-            <w:lang w:val="en-MY"/>
           </w:rPr>
           <w:fldChar w:fldCharType="separate"/>
         </w:r>
@@ -1658,7 +1497,6 @@
           <w:rPr>
             <w:noProof/>
             <w:webHidden/>
-            <w:lang w:val="en-MY"/>
           </w:rPr>
           <w:t>8</w:t>
         </w:r>
@@ -1666,7 +1504,6 @@
           <w:rPr>
             <w:noProof/>
             <w:webHidden/>
-            <w:lang w:val="en-MY"/>
           </w:rPr>
           <w:fldChar w:fldCharType="end"/>
         </w:r>
@@ -1688,7 +1525,7 @@
           <w14:ligatures w14:val="standardContextual"/>
         </w:rPr>
       </w:pPr>
-      <w:hyperlink w:anchor="_Toc240036226" w:history="1">
+      <w:hyperlink w:anchor="_Toc240537823" w:history="1">
         <w:r>
           <w:rPr>
             <w:rStyle w:val="Hyperlink"/>
@@ -1701,7 +1538,6 @@
           <w:rPr>
             <w:noProof/>
             <w:webHidden/>
-            <w:lang w:val="en-MY"/>
           </w:rPr>
           <w:tab/>
         </w:r>
@@ -1709,7 +1545,6 @@
           <w:rPr>
             <w:noProof/>
             <w:webHidden/>
-            <w:lang w:val="en-MY"/>
           </w:rPr>
           <w:fldChar w:fldCharType="begin"/>
         </w:r>
@@ -1717,22 +1552,19 @@
           <w:rPr>
             <w:noProof/>
             <w:webHidden/>
-            <w:lang w:val="en-MY"/>
           </w:rPr>
-          <w:instrText xml:space="preserve"> PAGEREF _Toc240036226 \h </w:instrText>
+          <w:instrText xml:space="preserve"> PAGEREF _Toc240537823 \h </w:instrText>
         </w:r>
         <w:r>
           <w:rPr>
             <w:noProof/>
             <w:webHidden/>
-            <w:lang w:val="en-MY"/>
           </w:rPr>
         </w:r>
         <w:r>
           <w:rPr>
             <w:noProof/>
             <w:webHidden/>
-            <w:lang w:val="en-MY"/>
           </w:rPr>
           <w:fldChar w:fldCharType="separate"/>
         </w:r>
@@ -1740,7 +1572,6 @@
           <w:rPr>
             <w:noProof/>
             <w:webHidden/>
-            <w:lang w:val="en-MY"/>
           </w:rPr>
           <w:t>8</w:t>
         </w:r>
@@ -1748,7 +1579,6 @@
           <w:rPr>
             <w:noProof/>
             <w:webHidden/>
-            <w:lang w:val="en-MY"/>
           </w:rPr>
           <w:fldChar w:fldCharType="end"/>
         </w:r>
@@ -1770,20 +1600,19 @@
           <w14:ligatures w14:val="standardContextual"/>
         </w:rPr>
       </w:pPr>
-      <w:hyperlink w:anchor="_Toc240036227" w:history="1">
+      <w:hyperlink w:anchor="_Toc240537824" w:history="1">
         <w:r>
           <w:rPr>
             <w:rStyle w:val="Hyperlink"/>
             <w:noProof/>
             <w:lang w:val="en-MY"/>
           </w:rPr>
-          <w:t>2.4 What the system will not do</w:t>
+          <w:t>2.4 System Limitation</w:t>
         </w:r>
         <w:r>
           <w:rPr>
             <w:noProof/>
             <w:webHidden/>
-            <w:lang w:val="en-MY"/>
           </w:rPr>
           <w:tab/>
         </w:r>
@@ -1791,7 +1620,6 @@
           <w:rPr>
             <w:noProof/>
             <w:webHidden/>
-            <w:lang w:val="en-MY"/>
           </w:rPr>
           <w:fldChar w:fldCharType="begin"/>
         </w:r>
@@ -1799,22 +1627,19 @@
           <w:rPr>
             <w:noProof/>
             <w:webHidden/>
-            <w:lang w:val="en-MY"/>
           </w:rPr>
-          <w:instrText xml:space="preserve"> PAGEREF _Toc240036227 \h </w:instrText>
+          <w:instrText xml:space="preserve"> PAGEREF _Toc240537824 \h </w:instrText>
         </w:r>
         <w:r>
           <w:rPr>
             <w:noProof/>
             <w:webHidden/>
-            <w:lang w:val="en-MY"/>
           </w:rPr>
         </w:r>
         <w:r>
           <w:rPr>
             <w:noProof/>
             <w:webHidden/>
-            <w:lang w:val="en-MY"/>
           </w:rPr>
           <w:fldChar w:fldCharType="separate"/>
         </w:r>
@@ -1822,7 +1647,6 @@
           <w:rPr>
             <w:noProof/>
             <w:webHidden/>
-            <w:lang w:val="en-MY"/>
           </w:rPr>
           <w:t>9</w:t>
         </w:r>
@@ -1830,7 +1654,6 @@
           <w:rPr>
             <w:noProof/>
             <w:webHidden/>
-            <w:lang w:val="en-MY"/>
           </w:rPr>
           <w:fldChar w:fldCharType="end"/>
         </w:r>
@@ -1852,7 +1675,7 @@
           <w14:ligatures w14:val="standardContextual"/>
         </w:rPr>
       </w:pPr>
-      <w:hyperlink w:anchor="_Toc240036228" w:history="1">
+      <w:hyperlink w:anchor="_Toc240537825" w:history="1">
         <w:r>
           <w:rPr>
             <w:rStyle w:val="Hyperlink"/>
@@ -1865,7 +1688,6 @@
           <w:rPr>
             <w:noProof/>
             <w:webHidden/>
-            <w:lang w:val="en-MY"/>
           </w:rPr>
           <w:tab/>
         </w:r>
@@ -1873,7 +1695,6 @@
           <w:rPr>
             <w:noProof/>
             <w:webHidden/>
-            <w:lang w:val="en-MY"/>
           </w:rPr>
           <w:fldChar w:fldCharType="begin"/>
         </w:r>
@@ -1881,22 +1702,19 @@
           <w:rPr>
             <w:noProof/>
             <w:webHidden/>
-            <w:lang w:val="en-MY"/>
           </w:rPr>
-          <w:instrText xml:space="preserve"> PAGEREF _Toc240036228 \h </w:instrText>
+          <w:instrText xml:space="preserve"> PAGEREF _Toc240537825 \h </w:instrText>
         </w:r>
         <w:r>
           <w:rPr>
             <w:noProof/>
             <w:webHidden/>
-            <w:lang w:val="en-MY"/>
           </w:rPr>
         </w:r>
         <w:r>
           <w:rPr>
             <w:noProof/>
             <w:webHidden/>
-            <w:lang w:val="en-MY"/>
           </w:rPr>
           <w:fldChar w:fldCharType="separate"/>
         </w:r>
@@ -1904,7 +1722,6 @@
           <w:rPr>
             <w:noProof/>
             <w:webHidden/>
-            <w:lang w:val="en-MY"/>
           </w:rPr>
           <w:t>9</w:t>
         </w:r>
@@ -1912,7 +1729,6 @@
           <w:rPr>
             <w:noProof/>
             <w:webHidden/>
-            <w:lang w:val="en-MY"/>
           </w:rPr>
           <w:fldChar w:fldCharType="end"/>
         </w:r>
@@ -1934,20 +1750,19 @@
           <w14:ligatures w14:val="standardContextual"/>
         </w:rPr>
       </w:pPr>
-      <w:hyperlink w:anchor="_Toc240036229" w:history="1">
+      <w:hyperlink w:anchor="_Toc240537826" w:history="1">
         <w:r>
           <w:rPr>
             <w:rStyle w:val="Hyperlink"/>
             <w:noProof/>
             <w:lang w:val="en-MY"/>
           </w:rPr>
-          <w:t>3.1 The eight classes you need</w:t>
+          <w:t>3.1 Class Framework</w:t>
         </w:r>
         <w:r>
           <w:rPr>
             <w:noProof/>
             <w:webHidden/>
-            <w:lang w:val="en-MY"/>
           </w:rPr>
           <w:tab/>
         </w:r>
@@ -1955,7 +1770,6 @@
           <w:rPr>
             <w:noProof/>
             <w:webHidden/>
-            <w:lang w:val="en-MY"/>
           </w:rPr>
           <w:fldChar w:fldCharType="begin"/>
         </w:r>
@@ -1963,22 +1777,19 @@
           <w:rPr>
             <w:noProof/>
             <w:webHidden/>
-            <w:lang w:val="en-MY"/>
           </w:rPr>
-          <w:instrText xml:space="preserve"> PAGEREF _Toc240036229 \h </w:instrText>
+          <w:instrText xml:space="preserve"> PAGEREF _Toc240537826 \h </w:instrText>
         </w:r>
         <w:r>
           <w:rPr>
             <w:noProof/>
             <w:webHidden/>
-            <w:lang w:val="en-MY"/>
           </w:rPr>
         </w:r>
         <w:r>
           <w:rPr>
             <w:noProof/>
             <w:webHidden/>
-            <w:lang w:val="en-MY"/>
           </w:rPr>
           <w:fldChar w:fldCharType="separate"/>
         </w:r>
@@ -1986,7 +1797,6 @@
           <w:rPr>
             <w:noProof/>
             <w:webHidden/>
-            <w:lang w:val="en-MY"/>
           </w:rPr>
           <w:t>9</w:t>
         </w:r>
@@ -1994,7 +1804,6 @@
           <w:rPr>
             <w:noProof/>
             <w:webHidden/>
-            <w:lang w:val="en-MY"/>
           </w:rPr>
           <w:fldChar w:fldCharType="end"/>
         </w:r>
@@ -2016,7 +1825,7 @@
           <w14:ligatures w14:val="standardContextual"/>
         </w:rPr>
       </w:pPr>
-      <w:hyperlink w:anchor="_Toc240036230" w:history="1">
+      <w:hyperlink w:anchor="_Toc240537827" w:history="1">
         <w:r>
           <w:rPr>
             <w:rStyle w:val="Hyperlink"/>
@@ -2029,7 +1838,6 @@
           <w:rPr>
             <w:noProof/>
             <w:webHidden/>
-            <w:lang w:val="en-MY"/>
           </w:rPr>
           <w:tab/>
         </w:r>
@@ -2037,7 +1845,6 @@
           <w:rPr>
             <w:noProof/>
             <w:webHidden/>
-            <w:lang w:val="en-MY"/>
           </w:rPr>
           <w:fldChar w:fldCharType="begin"/>
         </w:r>
@@ -2045,22 +1852,19 @@
           <w:rPr>
             <w:noProof/>
             <w:webHidden/>
-            <w:lang w:val="en-MY"/>
           </w:rPr>
-          <w:instrText xml:space="preserve"> PAGEREF _Toc240036230 \h </w:instrText>
+          <w:instrText xml:space="preserve"> PAGEREF _Toc240537827 \h </w:instrText>
         </w:r>
         <w:r>
           <w:rPr>
             <w:noProof/>
             <w:webHidden/>
-            <w:lang w:val="en-MY"/>
           </w:rPr>
         </w:r>
         <w:r>
           <w:rPr>
             <w:noProof/>
             <w:webHidden/>
-            <w:lang w:val="en-MY"/>
           </w:rPr>
           <w:fldChar w:fldCharType="separate"/>
         </w:r>
@@ -2068,7 +1872,6 @@
           <w:rPr>
             <w:noProof/>
             <w:webHidden/>
-            <w:lang w:val="en-MY"/>
           </w:rPr>
           <w:t>9</w:t>
         </w:r>
@@ -2076,7 +1879,6 @@
           <w:rPr>
             <w:noProof/>
             <w:webHidden/>
-            <w:lang w:val="en-MY"/>
           </w:rPr>
           <w:fldChar w:fldCharType="end"/>
         </w:r>
@@ -2098,7 +1900,7 @@
           <w14:ligatures w14:val="standardContextual"/>
         </w:rPr>
       </w:pPr>
-      <w:hyperlink w:anchor="_Toc240036231" w:history="1">
+      <w:hyperlink w:anchor="_Toc240537828" w:history="1">
         <w:r>
           <w:rPr>
             <w:rStyle w:val="Hyperlink"/>
@@ -2111,7 +1913,6 @@
           <w:rPr>
             <w:noProof/>
             <w:webHidden/>
-            <w:lang w:val="en-MY"/>
           </w:rPr>
           <w:tab/>
         </w:r>
@@ -2119,7 +1920,6 @@
           <w:rPr>
             <w:noProof/>
             <w:webHidden/>
-            <w:lang w:val="en-MY"/>
           </w:rPr>
           <w:fldChar w:fldCharType="begin"/>
         </w:r>
@@ -2127,22 +1927,19 @@
           <w:rPr>
             <w:noProof/>
             <w:webHidden/>
-            <w:lang w:val="en-MY"/>
           </w:rPr>
-          <w:instrText xml:space="preserve"> PAGEREF _Toc240036231 \h </w:instrText>
+          <w:instrText xml:space="preserve"> PAGEREF _Toc240537828 \h </w:instrText>
         </w:r>
         <w:r>
           <w:rPr>
             <w:noProof/>
             <w:webHidden/>
-            <w:lang w:val="en-MY"/>
           </w:rPr>
         </w:r>
         <w:r>
           <w:rPr>
             <w:noProof/>
             <w:webHidden/>
-            <w:lang w:val="en-MY"/>
           </w:rPr>
           <w:fldChar w:fldCharType="separate"/>
         </w:r>
@@ -2150,7 +1947,6 @@
           <w:rPr>
             <w:noProof/>
             <w:webHidden/>
-            <w:lang w:val="en-MY"/>
           </w:rPr>
           <w:t>10</w:t>
         </w:r>
@@ -2158,7 +1954,6 @@
           <w:rPr>
             <w:noProof/>
             <w:webHidden/>
-            <w:lang w:val="en-MY"/>
           </w:rPr>
           <w:fldChar w:fldCharType="end"/>
         </w:r>
@@ -2180,20 +1975,19 @@
           <w14:ligatures w14:val="standardContextual"/>
         </w:rPr>
       </w:pPr>
-      <w:hyperlink w:anchor="_Toc240036232" w:history="1">
+      <w:hyperlink w:anchor="_Toc240537829" w:history="1">
         <w:r>
           <w:rPr>
             <w:rStyle w:val="Hyperlink"/>
             <w:noProof/>
             <w:lang w:val="en-MY"/>
           </w:rPr>
-          <w:t>3.4 Using the Results in the UI</w:t>
+          <w:t>3.4 Result Display in the UI</w:t>
         </w:r>
         <w:r>
           <w:rPr>
             <w:noProof/>
             <w:webHidden/>
-            <w:lang w:val="en-MY"/>
           </w:rPr>
           <w:tab/>
         </w:r>
@@ -2201,7 +1995,6 @@
           <w:rPr>
             <w:noProof/>
             <w:webHidden/>
-            <w:lang w:val="en-MY"/>
           </w:rPr>
           <w:fldChar w:fldCharType="begin"/>
         </w:r>
@@ -2209,22 +2002,19 @@
           <w:rPr>
             <w:noProof/>
             <w:webHidden/>
-            <w:lang w:val="en-MY"/>
           </w:rPr>
-          <w:instrText xml:space="preserve"> PAGEREF _Toc240036232 \h </w:instrText>
+          <w:instrText xml:space="preserve"> PAGEREF _Toc240537829 \h </w:instrText>
         </w:r>
         <w:r>
           <w:rPr>
             <w:noProof/>
             <w:webHidden/>
-            <w:lang w:val="en-MY"/>
           </w:rPr>
         </w:r>
         <w:r>
           <w:rPr>
             <w:noProof/>
             <w:webHidden/>
-            <w:lang w:val="en-MY"/>
           </w:rPr>
           <w:fldChar w:fldCharType="separate"/>
         </w:r>
@@ -2232,7 +2022,6 @@
           <w:rPr>
             <w:noProof/>
             <w:webHidden/>
-            <w:lang w:val="en-MY"/>
           </w:rPr>
           <w:t>12</w:t>
         </w:r>
@@ -2240,7 +2029,6 @@
           <w:rPr>
             <w:noProof/>
             <w:webHidden/>
-            <w:lang w:val="en-MY"/>
           </w:rPr>
           <w:fldChar w:fldCharType="end"/>
         </w:r>
@@ -2262,7 +2050,7 @@
           <w14:ligatures w14:val="standardContextual"/>
         </w:rPr>
       </w:pPr>
-      <w:hyperlink w:anchor="_Toc240036233" w:history="1">
+      <w:hyperlink w:anchor="_Toc240537830" w:history="1">
         <w:r>
           <w:rPr>
             <w:rStyle w:val="Hyperlink"/>
@@ -2275,7 +2063,6 @@
           <w:rPr>
             <w:noProof/>
             <w:webHidden/>
-            <w:lang w:val="en-MY"/>
           </w:rPr>
           <w:tab/>
         </w:r>
@@ -2283,7 +2070,6 @@
           <w:rPr>
             <w:noProof/>
             <w:webHidden/>
-            <w:lang w:val="en-MY"/>
           </w:rPr>
           <w:fldChar w:fldCharType="begin"/>
         </w:r>
@@ -2291,22 +2077,19 @@
           <w:rPr>
             <w:noProof/>
             <w:webHidden/>
-            <w:lang w:val="en-MY"/>
           </w:rPr>
-          <w:instrText xml:space="preserve"> PAGEREF _Toc240036233 \h </w:instrText>
+          <w:instrText xml:space="preserve"> PAGEREF _Toc240537830 \h </w:instrText>
         </w:r>
         <w:r>
           <w:rPr>
             <w:noProof/>
             <w:webHidden/>
-            <w:lang w:val="en-MY"/>
           </w:rPr>
         </w:r>
         <w:r>
           <w:rPr>
             <w:noProof/>
             <w:webHidden/>
-            <w:lang w:val="en-MY"/>
           </w:rPr>
           <w:fldChar w:fldCharType="separate"/>
         </w:r>
@@ -2314,7 +2097,6 @@
           <w:rPr>
             <w:noProof/>
             <w:webHidden/>
-            <w:lang w:val="en-MY"/>
           </w:rPr>
           <w:t>12</w:t>
         </w:r>
@@ -2322,7 +2104,6 @@
           <w:rPr>
             <w:noProof/>
             <w:webHidden/>
-            <w:lang w:val="en-MY"/>
           </w:rPr>
           <w:fldChar w:fldCharType="end"/>
         </w:r>
@@ -2344,7 +2125,7 @@
           <w14:ligatures w14:val="standardContextual"/>
         </w:rPr>
       </w:pPr>
-      <w:hyperlink w:anchor="_Toc240036234" w:history="1">
+      <w:hyperlink w:anchor="_Toc240537831" w:history="1">
         <w:r>
           <w:rPr>
             <w:rStyle w:val="Hyperlink"/>
@@ -2357,7 +2138,6 @@
           <w:rPr>
             <w:noProof/>
             <w:webHidden/>
-            <w:lang w:val="en-MY"/>
           </w:rPr>
           <w:tab/>
         </w:r>
@@ -2365,7 +2145,6 @@
           <w:rPr>
             <w:noProof/>
             <w:webHidden/>
-            <w:lang w:val="en-MY"/>
           </w:rPr>
           <w:fldChar w:fldCharType="begin"/>
         </w:r>
@@ -2373,22 +2152,19 @@
           <w:rPr>
             <w:noProof/>
             <w:webHidden/>
-            <w:lang w:val="en-MY"/>
           </w:rPr>
-          <w:instrText xml:space="preserve"> PAGEREF _Toc240036234 \h </w:instrText>
+          <w:instrText xml:space="preserve"> PAGEREF _Toc240537831 \h </w:instrText>
         </w:r>
         <w:r>
           <w:rPr>
             <w:noProof/>
             <w:webHidden/>
-            <w:lang w:val="en-MY"/>
           </w:rPr>
         </w:r>
         <w:r>
           <w:rPr>
             <w:noProof/>
             <w:webHidden/>
-            <w:lang w:val="en-MY"/>
           </w:rPr>
           <w:fldChar w:fldCharType="separate"/>
         </w:r>
@@ -2396,7 +2172,6 @@
           <w:rPr>
             <w:noProof/>
             <w:webHidden/>
-            <w:lang w:val="en-MY"/>
           </w:rPr>
           <w:t>12</w:t>
         </w:r>
@@ -2404,7 +2179,6 @@
           <w:rPr>
             <w:noProof/>
             <w:webHidden/>
-            <w:lang w:val="en-MY"/>
           </w:rPr>
           <w:fldChar w:fldCharType="end"/>
         </w:r>
@@ -2426,7 +2200,7 @@
           <w14:ligatures w14:val="standardContextual"/>
         </w:rPr>
       </w:pPr>
-      <w:hyperlink w:anchor="_Toc240036235" w:history="1">
+      <w:hyperlink w:anchor="_Toc240537832" w:history="1">
         <w:r>
           <w:rPr>
             <w:rStyle w:val="Hyperlink"/>
@@ -2439,7 +2213,6 @@
           <w:rPr>
             <w:noProof/>
             <w:webHidden/>
-            <w:lang w:val="en-MY"/>
           </w:rPr>
           <w:tab/>
         </w:r>
@@ -2447,7 +2220,6 @@
           <w:rPr>
             <w:noProof/>
             <w:webHidden/>
-            <w:lang w:val="en-MY"/>
           </w:rPr>
           <w:fldChar w:fldCharType="begin"/>
         </w:r>
@@ -2455,22 +2227,19 @@
           <w:rPr>
             <w:noProof/>
             <w:webHidden/>
-            <w:lang w:val="en-MY"/>
           </w:rPr>
-          <w:instrText xml:space="preserve"> PAGEREF _Toc240036235 \h </w:instrText>
+          <w:instrText xml:space="preserve"> PAGEREF _Toc240537832 \h </w:instrText>
         </w:r>
         <w:r>
           <w:rPr>
             <w:noProof/>
             <w:webHidden/>
-            <w:lang w:val="en-MY"/>
           </w:rPr>
         </w:r>
         <w:r>
           <w:rPr>
             <w:noProof/>
             <w:webHidden/>
-            <w:lang w:val="en-MY"/>
           </w:rPr>
           <w:fldChar w:fldCharType="separate"/>
         </w:r>
@@ -2478,7 +2247,6 @@
           <w:rPr>
             <w:noProof/>
             <w:webHidden/>
-            <w:lang w:val="en-MY"/>
           </w:rPr>
           <w:t>13</w:t>
         </w:r>
@@ -2486,7 +2254,6 @@
           <w:rPr>
             <w:noProof/>
             <w:webHidden/>
-            <w:lang w:val="en-MY"/>
           </w:rPr>
           <w:fldChar w:fldCharType="end"/>
         </w:r>
@@ -2508,7 +2275,7 @@
           <w14:ligatures w14:val="standardContextual"/>
         </w:rPr>
       </w:pPr>
-      <w:hyperlink w:anchor="_Toc240036236" w:history="1">
+      <w:hyperlink w:anchor="_Toc240537833" w:history="1">
         <w:r>
           <w:rPr>
             <w:rStyle w:val="Hyperlink"/>
@@ -2521,7 +2288,6 @@
           <w:rPr>
             <w:noProof/>
             <w:webHidden/>
-            <w:lang w:val="en-MY"/>
           </w:rPr>
           <w:tab/>
         </w:r>
@@ -2529,7 +2295,6 @@
           <w:rPr>
             <w:noProof/>
             <w:webHidden/>
-            <w:lang w:val="en-MY"/>
           </w:rPr>
           <w:fldChar w:fldCharType="begin"/>
         </w:r>
@@ -2537,22 +2302,19 @@
           <w:rPr>
             <w:noProof/>
             <w:webHidden/>
-            <w:lang w:val="en-MY"/>
           </w:rPr>
-          <w:instrText xml:space="preserve"> PAGEREF _Toc240036236 \h </w:instrText>
+          <w:instrText xml:space="preserve"> PAGEREF _Toc240537833 \h </w:instrText>
         </w:r>
         <w:r>
           <w:rPr>
             <w:noProof/>
             <w:webHidden/>
-            <w:lang w:val="en-MY"/>
           </w:rPr>
         </w:r>
         <w:r>
           <w:rPr>
             <w:noProof/>
             <w:webHidden/>
-            <w:lang w:val="en-MY"/>
           </w:rPr>
           <w:fldChar w:fldCharType="separate"/>
         </w:r>
@@ -2560,7 +2322,6 @@
           <w:rPr>
             <w:noProof/>
             <w:webHidden/>
-            <w:lang w:val="en-MY"/>
           </w:rPr>
           <w:t>14</w:t>
         </w:r>
@@ -2568,7 +2329,6 @@
           <w:rPr>
             <w:noProof/>
             <w:webHidden/>
-            <w:lang w:val="en-MY"/>
           </w:rPr>
           <w:fldChar w:fldCharType="end"/>
         </w:r>
@@ -2590,7 +2350,7 @@
           <w14:ligatures w14:val="standardContextual"/>
         </w:rPr>
       </w:pPr>
-      <w:hyperlink w:anchor="_Toc240036237" w:history="1">
+      <w:hyperlink w:anchor="_Toc240537834" w:history="1">
         <w:r>
           <w:rPr>
             <w:rStyle w:val="Hyperlink"/>
@@ -2603,7 +2363,6 @@
           <w:rPr>
             <w:noProof/>
             <w:webHidden/>
-            <w:lang w:val="en-MY"/>
           </w:rPr>
           <w:tab/>
         </w:r>
@@ -2611,7 +2370,6 @@
           <w:rPr>
             <w:noProof/>
             <w:webHidden/>
-            <w:lang w:val="en-MY"/>
           </w:rPr>
           <w:fldChar w:fldCharType="begin"/>
         </w:r>
@@ -2619,22 +2377,19 @@
           <w:rPr>
             <w:noProof/>
             <w:webHidden/>
-            <w:lang w:val="en-MY"/>
           </w:rPr>
-          <w:instrText xml:space="preserve"> PAGEREF _Toc240036237 \h </w:instrText>
+          <w:instrText xml:space="preserve"> PAGEREF _Toc240537834 \h </w:instrText>
         </w:r>
         <w:r>
           <w:rPr>
             <w:noProof/>
             <w:webHidden/>
-            <w:lang w:val="en-MY"/>
           </w:rPr>
         </w:r>
         <w:r>
           <w:rPr>
             <w:noProof/>
             <w:webHidden/>
-            <w:lang w:val="en-MY"/>
           </w:rPr>
           <w:fldChar w:fldCharType="separate"/>
         </w:r>
@@ -2642,7 +2397,6 @@
           <w:rPr>
             <w:noProof/>
             <w:webHidden/>
-            <w:lang w:val="en-MY"/>
           </w:rPr>
           <w:t>14</w:t>
         </w:r>
@@ -2650,7 +2404,6 @@
           <w:rPr>
             <w:noProof/>
             <w:webHidden/>
-            <w:lang w:val="en-MY"/>
           </w:rPr>
           <w:fldChar w:fldCharType="end"/>
         </w:r>
@@ -2672,7 +2425,7 @@
           <w14:ligatures w14:val="standardContextual"/>
         </w:rPr>
       </w:pPr>
-      <w:hyperlink w:anchor="_Toc240036238" w:history="1">
+      <w:hyperlink w:anchor="_Toc240537835" w:history="1">
         <w:r>
           <w:rPr>
             <w:rStyle w:val="Hyperlink"/>
@@ -2685,7 +2438,6 @@
           <w:rPr>
             <w:noProof/>
             <w:webHidden/>
-            <w:lang w:val="en-MY"/>
           </w:rPr>
           <w:tab/>
         </w:r>
@@ -2693,7 +2445,6 @@
           <w:rPr>
             <w:noProof/>
             <w:webHidden/>
-            <w:lang w:val="en-MY"/>
           </w:rPr>
           <w:fldChar w:fldCharType="begin"/>
         </w:r>
@@ -2701,22 +2452,19 @@
           <w:rPr>
             <w:noProof/>
             <w:webHidden/>
-            <w:lang w:val="en-MY"/>
           </w:rPr>
-          <w:instrText xml:space="preserve"> PAGEREF _Toc240036238 \h </w:instrText>
+          <w:instrText xml:space="preserve"> PAGEREF _Toc240537835 \h </w:instrText>
         </w:r>
         <w:r>
           <w:rPr>
             <w:noProof/>
             <w:webHidden/>
-            <w:lang w:val="en-MY"/>
           </w:rPr>
         </w:r>
         <w:r>
           <w:rPr>
             <w:noProof/>
             <w:webHidden/>
-            <w:lang w:val="en-MY"/>
           </w:rPr>
           <w:fldChar w:fldCharType="separate"/>
         </w:r>
@@ -2724,7 +2472,6 @@
           <w:rPr>
             <w:noProof/>
             <w:webHidden/>
-            <w:lang w:val="en-MY"/>
           </w:rPr>
           <w:t>14</w:t>
         </w:r>
@@ -2732,7 +2479,6 @@
           <w:rPr>
             <w:noProof/>
             <w:webHidden/>
-            <w:lang w:val="en-MY"/>
           </w:rPr>
           <w:fldChar w:fldCharType="end"/>
         </w:r>
@@ -2754,7 +2500,7 @@
           <w14:ligatures w14:val="standardContextual"/>
         </w:rPr>
       </w:pPr>
-      <w:hyperlink w:anchor="_Toc240036239" w:history="1">
+      <w:hyperlink w:anchor="_Toc240537836" w:history="1">
         <w:r>
           <w:rPr>
             <w:rStyle w:val="Hyperlink"/>
@@ -2767,7 +2513,6 @@
           <w:rPr>
             <w:noProof/>
             <w:webHidden/>
-            <w:lang w:val="en-MY"/>
           </w:rPr>
           <w:tab/>
         </w:r>
@@ -2775,7 +2520,6 @@
           <w:rPr>
             <w:noProof/>
             <w:webHidden/>
-            <w:lang w:val="en-MY"/>
           </w:rPr>
           <w:fldChar w:fldCharType="begin"/>
         </w:r>
@@ -2783,22 +2527,19 @@
           <w:rPr>
             <w:noProof/>
             <w:webHidden/>
-            <w:lang w:val="en-MY"/>
           </w:rPr>
-          <w:instrText xml:space="preserve"> PAGEREF _Toc240036239 \h </w:instrText>
+          <w:instrText xml:space="preserve"> PAGEREF _Toc240537836 \h </w:instrText>
         </w:r>
         <w:r>
           <w:rPr>
             <w:noProof/>
             <w:webHidden/>
-            <w:lang w:val="en-MY"/>
           </w:rPr>
         </w:r>
         <w:r>
           <w:rPr>
             <w:noProof/>
             <w:webHidden/>
-            <w:lang w:val="en-MY"/>
           </w:rPr>
           <w:fldChar w:fldCharType="separate"/>
         </w:r>
@@ -2806,7 +2547,6 @@
           <w:rPr>
             <w:noProof/>
             <w:webHidden/>
-            <w:lang w:val="en-MY"/>
           </w:rPr>
           <w:t>15</w:t>
         </w:r>
@@ -2814,7 +2554,6 @@
           <w:rPr>
             <w:noProof/>
             <w:webHidden/>
-            <w:lang w:val="en-MY"/>
           </w:rPr>
           <w:fldChar w:fldCharType="end"/>
         </w:r>
@@ -2836,7 +2575,7 @@
           <w14:ligatures w14:val="standardContextual"/>
         </w:rPr>
       </w:pPr>
-      <w:hyperlink w:anchor="_Toc240036240" w:history="1">
+      <w:hyperlink w:anchor="_Toc240537837" w:history="1">
         <w:r>
           <w:rPr>
             <w:rStyle w:val="Hyperlink"/>
@@ -2849,7 +2588,6 @@
           <w:rPr>
             <w:noProof/>
             <w:webHidden/>
-            <w:lang w:val="en-MY"/>
           </w:rPr>
           <w:tab/>
         </w:r>
@@ -2857,7 +2595,6 @@
           <w:rPr>
             <w:noProof/>
             <w:webHidden/>
-            <w:lang w:val="en-MY"/>
           </w:rPr>
           <w:fldChar w:fldCharType="begin"/>
         </w:r>
@@ -2865,22 +2602,19 @@
           <w:rPr>
             <w:noProof/>
             <w:webHidden/>
-            <w:lang w:val="en-MY"/>
           </w:rPr>
-          <w:instrText xml:space="preserve"> PAGEREF _Toc240036240 \h </w:instrText>
+          <w:instrText xml:space="preserve"> PAGEREF _Toc240537837 \h </w:instrText>
         </w:r>
         <w:r>
           <w:rPr>
             <w:noProof/>
             <w:webHidden/>
-            <w:lang w:val="en-MY"/>
           </w:rPr>
         </w:r>
         <w:r>
           <w:rPr>
             <w:noProof/>
             <w:webHidden/>
-            <w:lang w:val="en-MY"/>
           </w:rPr>
           <w:fldChar w:fldCharType="separate"/>
         </w:r>
@@ -2888,7 +2622,6 @@
           <w:rPr>
             <w:noProof/>
             <w:webHidden/>
-            <w:lang w:val="en-MY"/>
           </w:rPr>
           <w:t>15</w:t>
         </w:r>
@@ -2896,7 +2629,6 @@
           <w:rPr>
             <w:noProof/>
             <w:webHidden/>
-            <w:lang w:val="en-MY"/>
           </w:rPr>
           <w:fldChar w:fldCharType="end"/>
         </w:r>
@@ -2918,7 +2650,7 @@
           <w14:ligatures w14:val="standardContextual"/>
         </w:rPr>
       </w:pPr>
-      <w:hyperlink w:anchor="_Toc240036241" w:history="1">
+      <w:hyperlink w:anchor="_Toc240537838" w:history="1">
         <w:r>
           <w:rPr>
             <w:rStyle w:val="Hyperlink"/>
@@ -2931,7 +2663,6 @@
           <w:rPr>
             <w:noProof/>
             <w:webHidden/>
-            <w:lang w:val="en-MY"/>
           </w:rPr>
           <w:tab/>
         </w:r>
@@ -2939,7 +2670,6 @@
           <w:rPr>
             <w:noProof/>
             <w:webHidden/>
-            <w:lang w:val="en-MY"/>
           </w:rPr>
           <w:fldChar w:fldCharType="begin"/>
         </w:r>
@@ -2947,22 +2677,19 @@
           <w:rPr>
             <w:noProof/>
             <w:webHidden/>
-            <w:lang w:val="en-MY"/>
           </w:rPr>
-          <w:instrText xml:space="preserve"> PAGEREF _Toc240036241 \h </w:instrText>
+          <w:instrText xml:space="preserve"> PAGEREF _Toc240537838 \h </w:instrText>
         </w:r>
         <w:r>
           <w:rPr>
             <w:noProof/>
             <w:webHidden/>
-            <w:lang w:val="en-MY"/>
           </w:rPr>
         </w:r>
         <w:r>
           <w:rPr>
             <w:noProof/>
             <w:webHidden/>
-            <w:lang w:val="en-MY"/>
           </w:rPr>
           <w:fldChar w:fldCharType="separate"/>
         </w:r>
@@ -2970,7 +2697,6 @@
           <w:rPr>
             <w:noProof/>
             <w:webHidden/>
-            <w:lang w:val="en-MY"/>
           </w:rPr>
           <w:t>15</w:t>
         </w:r>
@@ -2978,7 +2704,6 @@
           <w:rPr>
             <w:noProof/>
             <w:webHidden/>
-            <w:lang w:val="en-MY"/>
           </w:rPr>
           <w:fldChar w:fldCharType="end"/>
         </w:r>
@@ -3000,7 +2725,7 @@
           <w14:ligatures w14:val="standardContextual"/>
         </w:rPr>
       </w:pPr>
-      <w:hyperlink w:anchor="_Toc240036242" w:history="1">
+      <w:hyperlink w:anchor="_Toc240537839" w:history="1">
         <w:r>
           <w:rPr>
             <w:rStyle w:val="Hyperlink"/>
@@ -3013,7 +2738,6 @@
           <w:rPr>
             <w:noProof/>
             <w:webHidden/>
-            <w:lang w:val="en-MY"/>
           </w:rPr>
           <w:tab/>
         </w:r>
@@ -3021,7 +2745,6 @@
           <w:rPr>
             <w:noProof/>
             <w:webHidden/>
-            <w:lang w:val="en-MY"/>
           </w:rPr>
           <w:fldChar w:fldCharType="begin"/>
         </w:r>
@@ -3029,22 +2752,19 @@
           <w:rPr>
             <w:noProof/>
             <w:webHidden/>
-            <w:lang w:val="en-MY"/>
           </w:rPr>
-          <w:instrText xml:space="preserve"> PAGEREF _Toc240036242 \h </w:instrText>
+          <w:instrText xml:space="preserve"> PAGEREF _Toc240537839 \h </w:instrText>
         </w:r>
         <w:r>
           <w:rPr>
             <w:noProof/>
             <w:webHidden/>
-            <w:lang w:val="en-MY"/>
           </w:rPr>
         </w:r>
         <w:r>
           <w:rPr>
             <w:noProof/>
             <w:webHidden/>
-            <w:lang w:val="en-MY"/>
           </w:rPr>
           <w:fldChar w:fldCharType="separate"/>
         </w:r>
@@ -3052,7 +2772,6 @@
           <w:rPr>
             <w:noProof/>
             <w:webHidden/>
-            <w:lang w:val="en-MY"/>
           </w:rPr>
           <w:t>15</w:t>
         </w:r>
@@ -3060,7 +2779,6 @@
           <w:rPr>
             <w:noProof/>
             <w:webHidden/>
-            <w:lang w:val="en-MY"/>
           </w:rPr>
           <w:fldChar w:fldCharType="end"/>
         </w:r>
@@ -3082,7 +2800,7 @@
           <w14:ligatures w14:val="standardContextual"/>
         </w:rPr>
       </w:pPr>
-      <w:hyperlink w:anchor="_Toc240036243" w:history="1">
+      <w:hyperlink w:anchor="_Toc240537840" w:history="1">
         <w:r>
           <w:rPr>
             <w:rStyle w:val="Hyperlink"/>
@@ -3095,7 +2813,6 @@
           <w:rPr>
             <w:noProof/>
             <w:webHidden/>
-            <w:lang w:val="en-MY"/>
           </w:rPr>
           <w:tab/>
         </w:r>
@@ -3103,7 +2820,6 @@
           <w:rPr>
             <w:noProof/>
             <w:webHidden/>
-            <w:lang w:val="en-MY"/>
           </w:rPr>
           <w:fldChar w:fldCharType="begin"/>
         </w:r>
@@ -3111,22 +2827,19 @@
           <w:rPr>
             <w:noProof/>
             <w:webHidden/>
-            <w:lang w:val="en-MY"/>
           </w:rPr>
-          <w:instrText xml:space="preserve"> PAGEREF _Toc240036243 \h </w:instrText>
+          <w:instrText xml:space="preserve"> PAGEREF _Toc240537840 \h </w:instrText>
         </w:r>
         <w:r>
           <w:rPr>
             <w:noProof/>
             <w:webHidden/>
-            <w:lang w:val="en-MY"/>
           </w:rPr>
         </w:r>
         <w:r>
           <w:rPr>
             <w:noProof/>
             <w:webHidden/>
-            <w:lang w:val="en-MY"/>
           </w:rPr>
           <w:fldChar w:fldCharType="separate"/>
         </w:r>
@@ -3134,7 +2847,6 @@
           <w:rPr>
             <w:noProof/>
             <w:webHidden/>
-            <w:lang w:val="en-MY"/>
           </w:rPr>
           <w:t>16</w:t>
         </w:r>
@@ -3142,7 +2854,6 @@
           <w:rPr>
             <w:noProof/>
             <w:webHidden/>
-            <w:lang w:val="en-MY"/>
           </w:rPr>
           <w:fldChar w:fldCharType="end"/>
         </w:r>
@@ -3164,7 +2875,7 @@
           <w14:ligatures w14:val="standardContextual"/>
         </w:rPr>
       </w:pPr>
-      <w:hyperlink w:anchor="_Toc240036244" w:history="1">
+      <w:hyperlink w:anchor="_Toc240537841" w:history="1">
         <w:r>
           <w:rPr>
             <w:rStyle w:val="Hyperlink"/>
@@ -3177,7 +2888,6 @@
           <w:rPr>
             <w:noProof/>
             <w:webHidden/>
-            <w:lang w:val="en-MY"/>
           </w:rPr>
           <w:tab/>
         </w:r>
@@ -3185,7 +2895,6 @@
           <w:rPr>
             <w:noProof/>
             <w:webHidden/>
-            <w:lang w:val="en-MY"/>
           </w:rPr>
           <w:fldChar w:fldCharType="begin"/>
         </w:r>
@@ -3193,22 +2902,19 @@
           <w:rPr>
             <w:noProof/>
             <w:webHidden/>
-            <w:lang w:val="en-MY"/>
           </w:rPr>
-          <w:instrText xml:space="preserve"> PAGEREF _Toc240036244 \h </w:instrText>
+          <w:instrText xml:space="preserve"> PAGEREF _Toc240537841 \h </w:instrText>
         </w:r>
         <w:r>
           <w:rPr>
             <w:noProof/>
             <w:webHidden/>
-            <w:lang w:val="en-MY"/>
           </w:rPr>
         </w:r>
         <w:r>
           <w:rPr>
             <w:noProof/>
             <w:webHidden/>
-            <w:lang w:val="en-MY"/>
           </w:rPr>
           <w:fldChar w:fldCharType="separate"/>
         </w:r>
@@ -3216,7 +2922,6 @@
           <w:rPr>
             <w:noProof/>
             <w:webHidden/>
-            <w:lang w:val="en-MY"/>
           </w:rPr>
           <w:t>16</w:t>
         </w:r>
@@ -3224,7 +2929,6 @@
           <w:rPr>
             <w:noProof/>
             <w:webHidden/>
-            <w:lang w:val="en-MY"/>
           </w:rPr>
           <w:fldChar w:fldCharType="end"/>
         </w:r>
@@ -3246,7 +2950,7 @@
           <w14:ligatures w14:val="standardContextual"/>
         </w:rPr>
       </w:pPr>
-      <w:hyperlink w:anchor="_Toc240036245" w:history="1">
+      <w:hyperlink w:anchor="_Toc240537842" w:history="1">
         <w:r>
           <w:rPr>
             <w:rStyle w:val="Hyperlink"/>
@@ -3259,7 +2963,6 @@
           <w:rPr>
             <w:noProof/>
             <w:webHidden/>
-            <w:lang w:val="en-MY"/>
           </w:rPr>
           <w:tab/>
         </w:r>
@@ -3267,7 +2970,6 @@
           <w:rPr>
             <w:noProof/>
             <w:webHidden/>
-            <w:lang w:val="en-MY"/>
           </w:rPr>
           <w:fldChar w:fldCharType="begin"/>
         </w:r>
@@ -3275,22 +2977,19 @@
           <w:rPr>
             <w:noProof/>
             <w:webHidden/>
-            <w:lang w:val="en-MY"/>
           </w:rPr>
-          <w:instrText xml:space="preserve"> PAGEREF _Toc240036245 \h </w:instrText>
+          <w:instrText xml:space="preserve"> PAGEREF _Toc240537842 \h </w:instrText>
         </w:r>
         <w:r>
           <w:rPr>
             <w:noProof/>
             <w:webHidden/>
-            <w:lang w:val="en-MY"/>
           </w:rPr>
         </w:r>
         <w:r>
           <w:rPr>
             <w:noProof/>
             <w:webHidden/>
-            <w:lang w:val="en-MY"/>
           </w:rPr>
           <w:fldChar w:fldCharType="separate"/>
         </w:r>
@@ -3298,7 +2997,6 @@
           <w:rPr>
             <w:noProof/>
             <w:webHidden/>
-            <w:lang w:val="en-MY"/>
           </w:rPr>
           <w:t>18</w:t>
         </w:r>
@@ -3306,7 +3004,6 @@
           <w:rPr>
             <w:noProof/>
             <w:webHidden/>
-            <w:lang w:val="en-MY"/>
           </w:rPr>
           <w:fldChar w:fldCharType="end"/>
         </w:r>
@@ -3328,20 +3025,35 @@
           <w14:ligatures w14:val="standardContextual"/>
         </w:rPr>
       </w:pPr>
-      <w:hyperlink w:anchor="_Toc240036246" w:history="1">
+      <w:hyperlink w:anchor="_Toc240537843" w:history="1">
         <w:r>
           <w:rPr>
             <w:rStyle w:val="Hyperlink"/>
             <w:noProof/>
             <w:lang w:val="en-MY"/>
           </w:rPr>
-          <w:t>4.7Known limitations</w:t>
+          <w:t>4.7</w:t>
+        </w:r>
+        <w:r>
+          <w:rPr>
+            <w:rStyle w:val="Hyperlink"/>
+            <w:noProof/>
+            <w:lang w:val="en-MY"/>
+          </w:rPr>
+          <w:t xml:space="preserve"> </w:t>
+        </w:r>
+        <w:r>
+          <w:rPr>
+            <w:rStyle w:val="Hyperlink"/>
+            <w:noProof/>
+            <w:lang w:val="en-MY"/>
+          </w:rPr>
+          <w:t>Known limitations</w:t>
         </w:r>
         <w:r>
           <w:rPr>
             <w:noProof/>
             <w:webHidden/>
-            <w:lang w:val="en-MY"/>
           </w:rPr>
           <w:tab/>
         </w:r>
@@ -3349,7 +3061,6 @@
           <w:rPr>
             <w:noProof/>
             <w:webHidden/>
-            <w:lang w:val="en-MY"/>
           </w:rPr>
           <w:fldChar w:fldCharType="begin"/>
         </w:r>
@@ -3357,22 +3068,19 @@
           <w:rPr>
             <w:noProof/>
             <w:webHidden/>
-            <w:lang w:val="en-MY"/>
           </w:rPr>
-          <w:instrText xml:space="preserve"> PAGEREF _Toc240036246 \h </w:instrText>
+          <w:instrText xml:space="preserve"> PAGEREF _Toc240537843 \h </w:instrText>
         </w:r>
         <w:r>
           <w:rPr>
             <w:noProof/>
             <w:webHidden/>
-            <w:lang w:val="en-MY"/>
           </w:rPr>
         </w:r>
         <w:r>
           <w:rPr>
             <w:noProof/>
             <w:webHidden/>
-            <w:lang w:val="en-MY"/>
           </w:rPr>
           <w:fldChar w:fldCharType="separate"/>
         </w:r>
@@ -3380,7 +3088,6 @@
           <w:rPr>
             <w:noProof/>
             <w:webHidden/>
-            <w:lang w:val="en-MY"/>
           </w:rPr>
           <w:t>18</w:t>
         </w:r>
@@ -3388,7 +3095,6 @@
           <w:rPr>
             <w:noProof/>
             <w:webHidden/>
-            <w:lang w:val="en-MY"/>
           </w:rPr>
           <w:fldChar w:fldCharType="end"/>
         </w:r>
@@ -3436,7 +3142,7 @@
           <w:lang w:val="en-MY"/>
         </w:rPr>
       </w:pPr>
-      <w:bookmarkStart w:id="2" w:name="_Toc240036215"/>
+      <w:bookmarkStart w:id="1" w:name="_Toc240537812"/>
       <w:r>
         <w:rPr>
           <w:noProof/>
@@ -3446,7 +3152,7 @@
         <w:lastRenderedPageBreak/>
         <w:t>Project summary</w:t>
       </w:r>
-      <w:bookmarkEnd w:id="2"/>
+      <w:bookmarkEnd w:id="1"/>
     </w:p>
     <w:p>
       <w:pPr>
@@ -3721,7 +3427,7 @@
           <w:lang w:val="en-MY"/>
         </w:rPr>
       </w:pPr>
-      <w:bookmarkStart w:id="3" w:name="_Toc240036216"/>
+      <w:bookmarkStart w:id="2" w:name="_Toc240537813"/>
       <w:r>
         <w:rPr>
           <w:noProof/>
@@ -3731,7 +3437,7 @@
         <w:lastRenderedPageBreak/>
         <w:t>1. Overview</w:t>
       </w:r>
-      <w:bookmarkEnd w:id="3"/>
+      <w:bookmarkEnd w:id="2"/>
     </w:p>
     <w:p>
       <w:pPr>
@@ -3771,16 +3477,32 @@
           <w:lang w:val="en-MY"/>
         </w:rPr>
       </w:pPr>
-      <w:bookmarkStart w:id="4" w:name="_Toc240036217"/>
+      <w:bookmarkStart w:id="3" w:name="_Toc240537814"/>
       <w:r>
         <w:rPr>
           <w:noProof/>
           <w:color w:val="000000" w:themeColor="text1"/>
           <w:lang w:val="en-MY"/>
         </w:rPr>
-        <w:t>1.1 The two class libraries</w:t>
+        <w:t xml:space="preserve">1.1 </w:t>
       </w:r>
-      <w:bookmarkEnd w:id="4"/>
+      <w:r>
+        <w:rPr>
+          <w:noProof/>
+          <w:color w:val="000000" w:themeColor="text1"/>
+          <w:lang w:val="en-MY"/>
+        </w:rPr>
+        <w:t>C</w:t>
+      </w:r>
+      <w:r>
+        <w:rPr>
+          <w:noProof/>
+          <w:color w:val="000000" w:themeColor="text1"/>
+          <w:lang w:val="en-MY"/>
+        </w:rPr>
+        <w:t>lass libraries</w:t>
+      </w:r>
+      <w:bookmarkEnd w:id="3"/>
     </w:p>
     <w:tbl>
       <w:tblPr>
@@ -4111,16 +3833,32 @@
           <w:lang w:val="en-MY"/>
         </w:rPr>
       </w:pPr>
-      <w:bookmarkStart w:id="5" w:name="_Toc240036218"/>
+      <w:bookmarkStart w:id="4" w:name="_Toc240537815"/>
       <w:r>
         <w:rPr>
           <w:noProof/>
           <w:color w:val="000000" w:themeColor="text1"/>
           <w:lang w:val="en-MY"/>
         </w:rPr>
-        <w:t>1.2 How many classes in each library</w:t>
+        <w:t xml:space="preserve">1.2 </w:t>
       </w:r>
-      <w:bookmarkEnd w:id="5"/>
+      <w:r>
+        <w:rPr>
+          <w:noProof/>
+          <w:color w:val="000000" w:themeColor="text1"/>
+          <w:lang w:val="en-MY"/>
+        </w:rPr>
+        <w:t xml:space="preserve">Total </w:t>
+      </w:r>
+      <w:r>
+        <w:rPr>
+          <w:noProof/>
+          <w:color w:val="000000" w:themeColor="text1"/>
+          <w:lang w:val="en-MY"/>
+        </w:rPr>
+        <w:t>classes in each library</w:t>
+      </w:r>
+      <w:bookmarkEnd w:id="4"/>
     </w:p>
     <w:tbl>
       <w:tblPr>
@@ -4678,7 +4416,7 @@
           <w:lang w:val="en-MY"/>
         </w:rPr>
       </w:pPr>
-      <w:bookmarkStart w:id="6" w:name="_Toc240036219"/>
+      <w:bookmarkStart w:id="5" w:name="_Toc240537816"/>
       <w:r>
         <w:rPr>
           <w:noProof/>
@@ -4687,7 +4425,7 @@
         </w:rPr>
         <w:t>1.3 Classes per namespace</w:t>
       </w:r>
-      <w:bookmarkEnd w:id="6"/>
+      <w:bookmarkEnd w:id="5"/>
     </w:p>
     <w:tbl>
       <w:tblPr>
@@ -5692,7 +5430,7 @@
           <w:lang w:val="en-MY"/>
         </w:rPr>
       </w:pPr>
-      <w:bookmarkStart w:id="7" w:name="_Toc240036220"/>
+      <w:bookmarkStart w:id="6" w:name="_Toc240537817"/>
       <w:r>
         <w:rPr>
           <w:noProof/>
@@ -5702,7 +5440,7 @@
         <w:lastRenderedPageBreak/>
         <w:t>1.4 Dependency direction</w:t>
       </w:r>
-      <w:bookmarkEnd w:id="7"/>
+      <w:bookmarkEnd w:id="6"/>
     </w:p>
     <w:p>
       <w:pPr>
@@ -5963,7 +5701,7 @@
           <w:lang w:val="en-MY"/>
         </w:rPr>
       </w:pPr>
-      <w:bookmarkStart w:id="8" w:name="_Toc240036221"/>
+      <w:bookmarkStart w:id="7" w:name="_Toc240537818"/>
       <w:r>
         <w:rPr>
           <w:noProof/>
@@ -5972,7 +5710,7 @@
         </w:rPr>
         <w:t>1.5 Processing sequence</w:t>
       </w:r>
-      <w:bookmarkEnd w:id="8"/>
+      <w:bookmarkEnd w:id="7"/>
     </w:p>
     <w:tbl>
       <w:tblPr>
@@ -6848,16 +6586,24 @@
           <w:lang w:val="en-MY"/>
         </w:rPr>
       </w:pPr>
-      <w:bookmarkStart w:id="9" w:name="_Toc240036222"/>
+      <w:bookmarkStart w:id="8" w:name="_Toc240537819"/>
       <w:r>
         <w:rPr>
           <w:noProof/>
           <w:color w:val="000000" w:themeColor="text1"/>
           <w:lang w:val="en-MY"/>
         </w:rPr>
-        <w:t>1.6 Who needs which section</w:t>
+        <w:t xml:space="preserve">1.6 </w:t>
       </w:r>
-      <w:bookmarkEnd w:id="9"/>
+      <w:r>
+        <w:rPr>
+          <w:noProof/>
+          <w:color w:val="000000" w:themeColor="text1"/>
+          <w:lang w:val="en-MY"/>
+        </w:rPr>
+        <w:t>Section Guide by User Role</w:t>
+      </w:r>
+      <w:bookmarkEnd w:id="8"/>
     </w:p>
     <w:tbl>
       <w:tblPr>
@@ -7342,7 +7088,7 @@
           <w:lang w:val="en-MY"/>
         </w:rPr>
       </w:pPr>
-      <w:bookmarkStart w:id="10" w:name="_Toc240036223"/>
+      <w:bookmarkStart w:id="9" w:name="_Toc240537820"/>
       <w:r>
         <w:rPr>
           <w:noProof/>
@@ -7352,7 +7098,7 @@
         <w:lastRenderedPageBreak/>
         <w:t>2. User usage</w:t>
       </w:r>
-      <w:bookmarkEnd w:id="10"/>
+      <w:bookmarkEnd w:id="9"/>
     </w:p>
     <w:p>
       <w:pPr>
@@ -7383,16 +7129,24 @@
           <w:lang w:val="en-MY"/>
         </w:rPr>
       </w:pPr>
-      <w:bookmarkStart w:id="11" w:name="_Toc240036224"/>
+      <w:bookmarkStart w:id="10" w:name="_Toc240537821"/>
       <w:r>
         <w:rPr>
           <w:noProof/>
           <w:color w:val="000000" w:themeColor="text1"/>
           <w:lang w:val="en-MY"/>
         </w:rPr>
-        <w:t>2.1 What the system produces for the user</w:t>
+        <w:t xml:space="preserve">2.1 </w:t>
       </w:r>
-      <w:bookmarkEnd w:id="11"/>
+      <w:r>
+        <w:rPr>
+          <w:noProof/>
+          <w:color w:val="000000" w:themeColor="text1"/>
+          <w:lang w:val="en-MY"/>
+        </w:rPr>
+        <w:t>System Output</w:t>
+      </w:r>
+      <w:bookmarkEnd w:id="10"/>
     </w:p>
     <w:tbl>
       <w:tblPr>
@@ -7822,7 +7576,7 @@
           <w:lang w:val="en-MY"/>
         </w:rPr>
       </w:pPr>
-      <w:bookmarkStart w:id="12" w:name="_Toc240036225"/>
+      <w:bookmarkStart w:id="11" w:name="_Toc240537822"/>
       <w:r>
         <w:rPr>
           <w:noProof/>
@@ -7839,7 +7593,7 @@
         </w:rPr>
         <w:t>Manual Review</w:t>
       </w:r>
-      <w:bookmarkEnd w:id="12"/>
+      <w:bookmarkEnd w:id="11"/>
     </w:p>
     <w:p>
       <w:pPr>
@@ -8207,7 +7961,7 @@
           <w:lang w:val="en-MY"/>
         </w:rPr>
       </w:pPr>
-      <w:bookmarkStart w:id="13" w:name="_Toc240036226"/>
+      <w:bookmarkStart w:id="12" w:name="_Toc240537823"/>
       <w:r>
         <w:rPr>
           <w:noProof/>
@@ -8224,7 +7978,7 @@
         </w:rPr>
         <w:t>Results and Data Storage</w:t>
       </w:r>
-      <w:bookmarkEnd w:id="13"/>
+      <w:bookmarkEnd w:id="12"/>
     </w:p>
     <w:p>
       <w:pPr>
@@ -8513,7 +8267,7 @@
           <w:lang w:val="en-MY"/>
         </w:rPr>
       </w:pPr>
-      <w:bookmarkStart w:id="14" w:name="_Toc240036227"/>
+      <w:bookmarkStart w:id="13" w:name="_Toc240537824"/>
       <w:r>
         <w:rPr>
           <w:noProof/>
@@ -8537,9 +8291,17 @@
           <w:color w:val="000000" w:themeColor="text1"/>
           <w:lang w:val="en-MY"/>
         </w:rPr>
-        <w:t xml:space="preserve"> What the system will not do</w:t>
+        <w:t xml:space="preserve"> </w:t>
       </w:r>
-      <w:bookmarkEnd w:id="14"/>
+      <w:r>
+        <w:rPr>
+          <w:noProof/>
+          <w:color w:val="000000" w:themeColor="text1"/>
+          <w:lang w:val="en-MY"/>
+        </w:rPr>
+        <w:t>System Limitation</w:t>
+      </w:r>
+      <w:bookmarkEnd w:id="13"/>
     </w:p>
     <w:p>
       <w:pPr>
@@ -8638,7 +8400,7 @@
           <w:lang w:val="en-MY"/>
         </w:rPr>
       </w:pPr>
-      <w:bookmarkStart w:id="15" w:name="_Toc240036228"/>
+      <w:bookmarkStart w:id="14" w:name="_Toc240537825"/>
       <w:r>
         <w:rPr>
           <w:noProof/>
@@ -8679,7 +8441,7 @@
         </w:rPr>
         <w:t>sage</w:t>
       </w:r>
-      <w:bookmarkEnd w:id="15"/>
+      <w:bookmarkEnd w:id="14"/>
     </w:p>
     <w:p>
       <w:pPr>
@@ -8710,16 +8472,24 @@
           <w:lang w:val="en-MY"/>
         </w:rPr>
       </w:pPr>
-      <w:bookmarkStart w:id="16" w:name="_Toc240036229"/>
+      <w:bookmarkStart w:id="15" w:name="_Toc240537826"/>
       <w:r>
         <w:rPr>
           <w:noProof/>
           <w:color w:val="000000" w:themeColor="text1"/>
           <w:lang w:val="en-MY"/>
         </w:rPr>
-        <w:t>3.1 The eight classes you need</w:t>
+        <w:t xml:space="preserve">3.1 </w:t>
       </w:r>
-      <w:bookmarkEnd w:id="16"/>
+      <w:r>
+        <w:rPr>
+          <w:noProof/>
+          <w:color w:val="000000" w:themeColor="text1"/>
+          <w:lang w:val="en-MY"/>
+        </w:rPr>
+        <w:t>Class Framework</w:t>
+      </w:r>
+      <w:bookmarkEnd w:id="15"/>
     </w:p>
     <w:tbl>
       <w:tblPr>
@@ -9620,7 +9390,7 @@
           <w:lang w:val="en-MY"/>
         </w:rPr>
       </w:pPr>
-      <w:bookmarkStart w:id="17" w:name="_Toc240036230"/>
+      <w:bookmarkStart w:id="16" w:name="_Toc240537827"/>
       <w:r>
         <w:rPr>
           <w:noProof/>
@@ -9637,7 +9407,7 @@
         </w:rPr>
         <w:t>Prerequisites and Setup</w:t>
       </w:r>
-      <w:bookmarkEnd w:id="17"/>
+      <w:bookmarkEnd w:id="16"/>
     </w:p>
     <w:tbl>
       <w:tblPr>
@@ -10716,7 +10486,7 @@
           <w:lang w:val="en-MY"/>
         </w:rPr>
       </w:pPr>
-      <w:bookmarkStart w:id="18" w:name="_Toc240036231"/>
+      <w:bookmarkStart w:id="17" w:name="_Toc240537828"/>
       <w:r>
         <w:rPr>
           <w:noProof/>
@@ -10749,7 +10519,7 @@
         </w:rPr>
         <w:t>Running the Pipeline</w:t>
       </w:r>
-      <w:bookmarkEnd w:id="18"/>
+      <w:bookmarkEnd w:id="17"/>
     </w:p>
     <w:p>
       <w:pPr>
@@ -11298,7 +11068,7 @@
           <w:lang w:val="en-MY"/>
         </w:rPr>
       </w:pPr>
-      <w:bookmarkStart w:id="19" w:name="_Toc240036232"/>
+      <w:bookmarkStart w:id="18" w:name="_Toc240537829"/>
       <w:r>
         <w:rPr>
           <w:noProof/>
@@ -11330,9 +11100,17 @@
           <w:color w:val="000000" w:themeColor="text1"/>
           <w:lang w:val="en-MY"/>
         </w:rPr>
-        <w:t>Using the Results in the UI</w:t>
+        <w:t xml:space="preserve">Result Display in </w:t>
       </w:r>
-      <w:bookmarkEnd w:id="19"/>
+      <w:r>
+        <w:rPr>
+          <w:noProof/>
+          <w:color w:val="000000" w:themeColor="text1"/>
+          <w:lang w:val="en-MY"/>
+        </w:rPr>
+        <w:t>the UI</w:t>
+      </w:r>
+      <w:bookmarkEnd w:id="18"/>
     </w:p>
     <w:p>
       <w:pPr>
@@ -11995,7 +11773,7 @@
           <w:lang w:val="en-MY"/>
         </w:rPr>
       </w:pPr>
-      <w:bookmarkStart w:id="20" w:name="_Toc240036233"/>
+      <w:bookmarkStart w:id="19" w:name="_Toc240537830"/>
       <w:r>
         <w:rPr>
           <w:noProof/>
@@ -12028,7 +11806,7 @@
         </w:rPr>
         <w:t>Manual Review</w:t>
       </w:r>
-      <w:bookmarkEnd w:id="20"/>
+      <w:bookmarkEnd w:id="19"/>
     </w:p>
     <w:p>
       <w:pPr>
@@ -12185,7 +11963,7 @@
           <w:lang w:val="en-MY"/>
         </w:rPr>
       </w:pPr>
-      <w:bookmarkStart w:id="21" w:name="_Toc240036234"/>
+      <w:bookmarkStart w:id="20" w:name="_Toc240537831"/>
       <w:r>
         <w:rPr>
           <w:noProof/>
@@ -12210,7 +11988,7 @@
         </w:rPr>
         <w:t xml:space="preserve"> Configuration</w:t>
       </w:r>
-      <w:bookmarkEnd w:id="21"/>
+      <w:bookmarkEnd w:id="20"/>
     </w:p>
     <w:p>
       <w:pPr>
@@ -12684,7 +12462,7 @@
           <w:lang w:val="en-MY"/>
         </w:rPr>
       </w:pPr>
-      <w:bookmarkStart w:id="22" w:name="_Toc240036235"/>
+      <w:bookmarkStart w:id="21" w:name="_Toc240537832"/>
       <w:r>
         <w:rPr>
           <w:noProof/>
@@ -12717,6 +12495,97 @@
           <w:lang w:val="en-MY"/>
         </w:rPr>
         <w:t>UI Integration Note</w:t>
+      </w:r>
+      <w:bookmarkEnd w:id="21"/>
+    </w:p>
+    <w:p>
+      <w:pPr>
+        <w:jc w:val="both"/>
+        <w:rPr>
+          <w:noProof/>
+          <w:color w:val="000000" w:themeColor="text1"/>
+          <w:lang w:val="en-MY"/>
+        </w:rPr>
+      </w:pPr>
+      <w:r>
+        <w:rPr>
+          <w:noProof/>
+          <w:color w:val="000000" w:themeColor="text1"/>
+          <w:lang w:val="en-MY"/>
+        </w:rPr>
+        <w:t xml:space="preserve">The UI should interact primarily with </w:t>
+      </w:r>
+      <w:r>
+        <w:rPr>
+          <w:rFonts w:ascii="Consolas" w:hAnsi="Consolas"/>
+          <w:noProof/>
+          <w:color w:val="000000" w:themeColor="text1"/>
+          <w:highlight w:val="lightGray"/>
+          <w:lang w:val="en-MY"/>
+        </w:rPr>
+        <w:t>DevicePipeline.RunAsync</w:t>
+      </w:r>
+      <w:r>
+        <w:rPr>
+          <w:noProof/>
+          <w:color w:val="000000" w:themeColor="text1"/>
+          <w:lang w:val="en-MY"/>
+        </w:rPr>
+        <w:t xml:space="preserve"> and the returned result objects. Console-oriented methods should not be used as part of a user interface; instead, the UI should render the returned data directly.</w:t>
+      </w:r>
+    </w:p>
+    <w:p>
+      <w:pPr>
+        <w:rPr>
+          <w:noProof/>
+          <w:color w:val="000000" w:themeColor="text1"/>
+          <w:lang w:val="en-MY"/>
+        </w:rPr>
+      </w:pPr>
+    </w:p>
+    <w:p>
+      <w:pPr>
+        <w:rPr>
+          <w:noProof/>
+          <w:color w:val="000000" w:themeColor="text1"/>
+          <w:lang w:val="en-MY"/>
+        </w:rPr>
+      </w:pPr>
+      <w:r>
+        <w:rPr>
+          <w:noProof/>
+          <w:color w:val="000000" w:themeColor="text1"/>
+          <w:lang w:val="en-MY"/>
+        </w:rPr>
+        <w:br w:type="page"/>
+      </w:r>
+    </w:p>
+    <w:p>
+      <w:pPr>
+        <w:pStyle w:val="Heading1"/>
+        <w:rPr>
+          <w:noProof/>
+          <w:color w:val="000000" w:themeColor="text1"/>
+          <w:lang w:val="en-MY"/>
+        </w:rPr>
+      </w:pPr>
+      <w:bookmarkStart w:id="22" w:name="_Toc240537833"/>
+      <w:r>
+        <w:rPr>
+          <w:noProof/>
+          <w:color w:val="000000" w:themeColor="text1"/>
+          <w:lang w:val="en-MY"/>
+        </w:rPr>
+        <w:lastRenderedPageBreak/>
+        <w:t>4. Internal usage</w:t>
+      </w:r>
+      <w:r>
+        <w:rPr>
+          <w:noProof/>
+          <w:color w:val="000000" w:themeColor="text1"/>
+          <w:lang w:val="en-MY"/>
+        </w:rPr>
+        <w:t xml:space="preserve"> (Technical Reference)</w:t>
       </w:r>
       <w:bookmarkEnd w:id="22"/>
     </w:p>
@@ -12735,97 +12604,6 @@
           <w:color w:val="000000" w:themeColor="text1"/>
           <w:lang w:val="en-MY"/>
         </w:rPr>
-        <w:t xml:space="preserve">The UI should interact primarily with </w:t>
-      </w:r>
-      <w:r>
-        <w:rPr>
-          <w:rFonts w:ascii="Consolas" w:hAnsi="Consolas"/>
-          <w:noProof/>
-          <w:color w:val="000000" w:themeColor="text1"/>
-          <w:highlight w:val="lightGray"/>
-          <w:lang w:val="en-MY"/>
-        </w:rPr>
-        <w:t>DevicePipeline.RunAsync</w:t>
-      </w:r>
-      <w:r>
-        <w:rPr>
-          <w:noProof/>
-          <w:color w:val="000000" w:themeColor="text1"/>
-          <w:lang w:val="en-MY"/>
-        </w:rPr>
-        <w:t xml:space="preserve"> and the returned result objects. Console-oriented methods should not be used as part of a user interface; instead, the UI should render the returned data directly.</w:t>
-      </w:r>
-    </w:p>
-    <w:p>
-      <w:pPr>
-        <w:rPr>
-          <w:noProof/>
-          <w:color w:val="000000" w:themeColor="text1"/>
-          <w:lang w:val="en-MY"/>
-        </w:rPr>
-      </w:pPr>
-    </w:p>
-    <w:p>
-      <w:pPr>
-        <w:rPr>
-          <w:noProof/>
-          <w:color w:val="000000" w:themeColor="text1"/>
-          <w:lang w:val="en-MY"/>
-        </w:rPr>
-      </w:pPr>
-      <w:r>
-        <w:rPr>
-          <w:noProof/>
-          <w:color w:val="000000" w:themeColor="text1"/>
-          <w:lang w:val="en-MY"/>
-        </w:rPr>
-        <w:br w:type="page"/>
-      </w:r>
-    </w:p>
-    <w:p>
-      <w:pPr>
-        <w:pStyle w:val="Heading1"/>
-        <w:rPr>
-          <w:noProof/>
-          <w:color w:val="000000" w:themeColor="text1"/>
-          <w:lang w:val="en-MY"/>
-        </w:rPr>
-      </w:pPr>
-      <w:bookmarkStart w:id="23" w:name="_Toc240036236"/>
-      <w:r>
-        <w:rPr>
-          <w:noProof/>
-          <w:color w:val="000000" w:themeColor="text1"/>
-          <w:lang w:val="en-MY"/>
-        </w:rPr>
-        <w:lastRenderedPageBreak/>
-        <w:t>4. Internal usage</w:t>
-      </w:r>
-      <w:r>
-        <w:rPr>
-          <w:noProof/>
-          <w:color w:val="000000" w:themeColor="text1"/>
-          <w:lang w:val="en-MY"/>
-        </w:rPr>
-        <w:t xml:space="preserve"> (Technical Reference)</w:t>
-      </w:r>
-      <w:bookmarkEnd w:id="23"/>
-    </w:p>
-    <w:p>
-      <w:pPr>
-        <w:jc w:val="both"/>
-        <w:rPr>
-          <w:noProof/>
-          <w:color w:val="000000" w:themeColor="text1"/>
-          <w:lang w:val="en-MY"/>
-        </w:rPr>
-      </w:pPr>
-      <w:r>
-        <w:rPr>
-          <w:noProof/>
-          <w:color w:val="000000" w:themeColor="text1"/>
-          <w:lang w:val="en-MY"/>
-        </w:rPr>
         <w:t>This section provides the technical reference required to maintain and extend Device Identifier. It focuses on the main classes, core processing logic, dependencies, database interaction and known limitations.</w:t>
       </w:r>
     </w:p>
@@ -12838,7 +12616,7 @@
           <w:lang w:val="en-MY"/>
         </w:rPr>
       </w:pPr>
-      <w:bookmarkStart w:id="24" w:name="_Toc240036237"/>
+      <w:bookmarkStart w:id="23" w:name="_Toc240537834"/>
       <w:r>
         <w:rPr>
           <w:noProof/>
@@ -12855,7 +12633,7 @@
         </w:rPr>
         <w:t>Library Structure</w:t>
       </w:r>
-      <w:bookmarkEnd w:id="24"/>
+      <w:bookmarkEnd w:id="23"/>
     </w:p>
     <w:p>
       <w:pPr>
@@ -13352,7 +13130,7 @@
           <w:lang w:val="en-MY"/>
         </w:rPr>
       </w:pPr>
-      <w:bookmarkStart w:id="25" w:name="_Toc240036238"/>
+      <w:bookmarkStart w:id="24" w:name="_Toc240537835"/>
       <w:r>
         <w:rPr>
           <w:noProof/>
@@ -13369,7 +13147,7 @@
         </w:rPr>
         <w:t>Key Classes</w:t>
       </w:r>
-      <w:bookmarkEnd w:id="25"/>
+      <w:bookmarkEnd w:id="24"/>
     </w:p>
     <w:p>
       <w:pPr>
@@ -14727,7 +14505,7 @@
           <w:lang w:val="en-MY"/>
         </w:rPr>
       </w:pPr>
-      <w:bookmarkStart w:id="26" w:name="_Toc240036239"/>
+      <w:bookmarkStart w:id="25" w:name="_Toc240537836"/>
       <w:r>
         <w:rPr>
           <w:noProof/>
@@ -14744,7 +14522,7 @@
         </w:rPr>
         <w:t>Core Processing Logic</w:t>
       </w:r>
-      <w:bookmarkEnd w:id="26"/>
+      <w:bookmarkEnd w:id="25"/>
     </w:p>
     <w:p>
       <w:pPr>
@@ -14758,7 +14536,7 @@
           <w:lang w:val="en-MY"/>
         </w:rPr>
       </w:pPr>
-      <w:bookmarkStart w:id="27" w:name="_Toc240036240"/>
+      <w:bookmarkStart w:id="26" w:name="_Toc240537837"/>
       <w:r>
         <w:rPr>
           <w:noProof/>
@@ -14767,7 +14545,7 @@
         </w:rPr>
         <w:t>ClusterQuotaAllocator</w:t>
       </w:r>
-      <w:bookmarkEnd w:id="27"/>
+      <w:bookmarkEnd w:id="26"/>
       <w:r>
         <w:rPr>
           <w:noProof/>
@@ -15095,7 +14873,7 @@
           <w:lang w:val="en-MY"/>
         </w:rPr>
       </w:pPr>
-      <w:bookmarkStart w:id="28" w:name="_Toc240036241"/>
+      <w:bookmarkStart w:id="27" w:name="_Toc240537838"/>
       <w:r>
         <w:rPr>
           <w:noProof/>
@@ -15104,7 +14882,7 @@
         </w:rPr>
         <w:t>Assignment Processing</w:t>
       </w:r>
-      <w:bookmarkEnd w:id="28"/>
+      <w:bookmarkEnd w:id="27"/>
     </w:p>
     <w:p>
       <w:pPr>
@@ -15307,7 +15085,7 @@
           <w:lang w:val="en-MY"/>
         </w:rPr>
       </w:pPr>
-      <w:bookmarkStart w:id="29" w:name="_Toc240036242"/>
+      <w:bookmarkStart w:id="28" w:name="_Toc240537839"/>
       <w:r>
         <w:rPr>
           <w:noProof/>
@@ -15316,7 +15094,7 @@
         </w:rPr>
         <w:t>Main Entry Point</w:t>
       </w:r>
-      <w:bookmarkEnd w:id="29"/>
+      <w:bookmarkEnd w:id="28"/>
     </w:p>
     <w:p>
       <w:pPr>
@@ -15379,7 +15157,7 @@
           <w:lang w:val="en-MY"/>
         </w:rPr>
       </w:pPr>
-      <w:bookmarkStart w:id="30" w:name="_Toc240036243"/>
+      <w:bookmarkStart w:id="29" w:name="_Toc240537840"/>
       <w:r>
         <w:rPr>
           <w:noProof/>
@@ -15397,7 +15175,7 @@
         </w:rPr>
         <w:t>Prediction Layer</w:t>
       </w:r>
-      <w:bookmarkEnd w:id="30"/>
+      <w:bookmarkEnd w:id="29"/>
     </w:p>
     <w:p>
       <w:pPr>
@@ -15930,7 +15708,7 @@
           <w:lang w:val="en-MY"/>
         </w:rPr>
       </w:pPr>
-      <w:bookmarkStart w:id="31" w:name="_Toc240036244"/>
+      <w:bookmarkStart w:id="30" w:name="_Toc240537841"/>
       <w:r>
         <w:rPr>
           <w:noProof/>
@@ -15947,7 +15725,7 @@
         </w:rPr>
         <w:t>Class Dependencies</w:t>
       </w:r>
-      <w:bookmarkEnd w:id="31"/>
+      <w:bookmarkEnd w:id="30"/>
     </w:p>
     <w:p>
       <w:pPr>
@@ -21180,7 +20958,7 @@
           <w:lang w:val="en-MY"/>
         </w:rPr>
       </w:pPr>
-      <w:bookmarkStart w:id="32" w:name="_Toc240036245"/>
+      <w:bookmarkStart w:id="31" w:name="_Toc240537842"/>
       <w:r>
         <w:rPr>
           <w:noProof/>
@@ -21190,7 +20968,7 @@
         <w:lastRenderedPageBreak/>
         <w:t>4.6 Database tables</w:t>
       </w:r>
-      <w:bookmarkEnd w:id="32"/>
+      <w:bookmarkEnd w:id="31"/>
     </w:p>
     <w:tbl>
       <w:tblPr>
@@ -21711,7 +21489,7 @@
           <w:lang w:val="en-MY"/>
         </w:rPr>
       </w:pPr>
-      <w:bookmarkStart w:id="33" w:name="_Toc240036246"/>
+      <w:bookmarkStart w:id="32" w:name="_Toc240537843"/>
       <w:r>
         <w:rPr>
           <w:noProof/>
@@ -21736,7 +21514,7 @@
         </w:rPr>
         <w:t>Known limitations</w:t>
       </w:r>
-      <w:bookmarkEnd w:id="33"/>
+      <w:bookmarkEnd w:id="32"/>
     </w:p>
     <w:p>
       <w:pPr>
@@ -22229,7 +22007,7 @@
   <w:abstractNum w:abstractNumId="8" w15:restartNumberingAfterBreak="0">
     <w:nsid w:val="FFFFFF89"/>
     <w:multiLevelType w:val="singleLevel"/>
-    <w:tmpl w:val="823CA752"/>
+    <w:tmpl w:val="D8443F78"/>
     <w:lvl w:ilvl="0">
       <w:start w:val="1"/>
       <w:numFmt w:val="bullet"/>
@@ -23710,7 +23488,6 @@
     <w:basedOn w:val="Heading1"/>
     <w:next w:val="Normal"/>
     <w:uiPriority w:val="39"/>
-    <w:semiHidden/>
     <w:unhideWhenUsed/>
     <w:qFormat/>
     <w:rsid w:val="00FC693F"/>

</xml_diff>

<commit_message>
Change term model.dll and logic.dll become XenAnalyticDevice.dll and XenAnalyticModel.dll
</commit_message>
<xml_diff>
--- a/Reference/DeviceIdentifier-API-FullReference.docx
+++ b/Reference/DeviceIdentifier-API-FullReference.docx
@@ -3327,7 +3327,7 @@
           <w:sz w:val="22"/>
           <w:lang w:val="en-MY"/>
         </w:rPr>
-        <w:t>Model.dll</w:t>
+        <w:t xml:space="preserve">XenAnalyticDevice.dll </w:t>
       </w:r>
       <w:r>
         <w:rPr>
@@ -3347,7 +3347,7 @@
           <w:sz w:val="22"/>
           <w:lang w:val="en-MY"/>
         </w:rPr>
-        <w:t>Logic.dll</w:t>
+        <w:t xml:space="preserve">XenAnalyticModel.dll </w:t>
       </w:r>
       <w:r>
         <w:rPr>
@@ -3356,7 +3356,43 @@
           <w:sz w:val="22"/>
           <w:lang w:val="en-MY"/>
         </w:rPr>
-        <w:t xml:space="preserve">. Model.dll manages communication between the C# application, SQL Server and the Python prediction layer. Logic.dll handles the business rules, including quota allocation, assignment processing and manual-review support. The system can run the Python prediction scripts locally or through an HTTP prediction service, while the main pipeline remains unchanged regardless of the deployment method. The primary entry point is </w:t>
+        <w:t xml:space="preserve">. </w:t>
+      </w:r>
+      <w:r>
+        <w:rPr>
+          <w:noProof/>
+          <w:color w:val="000000" w:themeColor="text1"/>
+          <w:sz w:val="22"/>
+          <w:lang w:val="en-MY"/>
+        </w:rPr>
+        <w:t xml:space="preserve">XenAnalyticDevice.dll </w:t>
+      </w:r>
+      <w:r>
+        <w:rPr>
+          <w:noProof/>
+          <w:color w:val="000000" w:themeColor="text1"/>
+          <w:sz w:val="22"/>
+          <w:lang w:val="en-MY"/>
+        </w:rPr>
+        <w:t xml:space="preserve"> manages communication between the C# application, SQL Server and the Python prediction layer. </w:t>
+      </w:r>
+      <w:r>
+        <w:rPr>
+          <w:noProof/>
+          <w:color w:val="000000" w:themeColor="text1"/>
+          <w:sz w:val="22"/>
+          <w:lang w:val="en-MY"/>
+        </w:rPr>
+        <w:t xml:space="preserve">XenAnalyticModel.dll </w:t>
+      </w:r>
+      <w:r>
+        <w:rPr>
+          <w:noProof/>
+          <w:color w:val="000000" w:themeColor="text1"/>
+          <w:sz w:val="22"/>
+          <w:lang w:val="en-MY"/>
+        </w:rPr>
+        <w:t xml:space="preserve"> handles the business rules, including quota allocation, assignment processing and manual-review support. The system can run the Python prediction scripts locally or through an HTTP prediction service, while the main pipeline remains unchanged regardless of the deployment method. The primary entry point is </w:t>
       </w:r>
       <w:r>
         <w:rPr>
@@ -3655,7 +3691,7 @@
                 <w:szCs w:val="20"/>
                 <w:lang w:val="en-MY"/>
               </w:rPr>
-              <w:t>Model.dll</w:t>
+              <w:t xml:space="preserve">XenAnalyticDevice.dll </w:t>
             </w:r>
           </w:p>
         </w:tc>
@@ -3748,7 +3784,7 @@
                 <w:szCs w:val="20"/>
                 <w:lang w:val="en-MY"/>
               </w:rPr>
-              <w:t>Logic.dll</w:t>
+              <w:t xml:space="preserve">XenAnalyticModel.dll </w:t>
             </w:r>
           </w:p>
         </w:tc>
@@ -4045,7 +4081,7 @@
                 <w:szCs w:val="20"/>
                 <w:lang w:val="en-MY"/>
               </w:rPr>
-              <w:t>Model.dll</w:t>
+              <w:t xml:space="preserve">XenAnalyticDevice.dll </w:t>
             </w:r>
           </w:p>
         </w:tc>
@@ -4170,7 +4206,7 @@
                 <w:szCs w:val="20"/>
                 <w:lang w:val="en-MY"/>
               </w:rPr>
-              <w:t>Logic.dll</w:t>
+              <w:t xml:space="preserve">XenAnalyticModel.dll </w:t>
             </w:r>
           </w:p>
         </w:tc>
@@ -4642,7 +4678,7 @@
                 <w:szCs w:val="20"/>
                 <w:lang w:val="en-MY"/>
               </w:rPr>
-              <w:t>Model.dll</w:t>
+              <w:t xml:space="preserve">XenAnalyticDevice.dll </w:t>
             </w:r>
           </w:p>
         </w:tc>
@@ -4760,7 +4796,7 @@
                 <w:szCs w:val="20"/>
                 <w:lang w:val="en-MY"/>
               </w:rPr>
-              <w:t>Model.dll</w:t>
+              <w:t xml:space="preserve">XenAnalyticDevice.dll </w:t>
             </w:r>
           </w:p>
         </w:tc>
@@ -4872,7 +4908,7 @@
                 <w:szCs w:val="20"/>
                 <w:lang w:val="en-MY"/>
               </w:rPr>
-              <w:t>Model.dll</w:t>
+              <w:t xml:space="preserve">XenAnalyticDevice.dll </w:t>
             </w:r>
           </w:p>
         </w:tc>
@@ -4984,7 +5020,7 @@
                 <w:szCs w:val="20"/>
                 <w:lang w:val="en-MY"/>
               </w:rPr>
-              <w:t>Logic.dll</w:t>
+              <w:t xml:space="preserve">XenAnalyticModel.dll </w:t>
             </w:r>
           </w:p>
         </w:tc>
@@ -5096,7 +5132,7 @@
                 <w:szCs w:val="20"/>
                 <w:lang w:val="en-MY"/>
               </w:rPr>
-              <w:t>Logic.dll</w:t>
+              <w:t xml:space="preserve">XenAnalyticModel.dll </w:t>
             </w:r>
           </w:p>
         </w:tc>
@@ -5208,7 +5244,7 @@
                 <w:szCs w:val="20"/>
                 <w:lang w:val="en-MY"/>
               </w:rPr>
-              <w:t>Logic.dll</w:t>
+              <w:t xml:space="preserve">XenAnalyticModel.dll </w:t>
             </w:r>
           </w:p>
         </w:tc>
@@ -5326,7 +5362,7 @@
                 <w:szCs w:val="20"/>
                 <w:lang w:val="en-MY"/>
               </w:rPr>
-              <w:t>Logic.dll</w:t>
+              <w:t xml:space="preserve">XenAnalyticModel.dll </w:t>
             </w:r>
           </w:p>
         </w:tc>
@@ -5418,6 +5454,7 @@
           <w:color w:val="000000" w:themeColor="text1"/>
           <w:lang w:val="en-MY"/>
         </w:rPr>
+        <w:lastRenderedPageBreak/>
         <w:br w:type="page"/>
       </w:r>
     </w:p>
@@ -5528,7 +5565,29 @@
           <w:szCs w:val="18"/>
           <w:lang w:val="en-MY"/>
         </w:rPr>
-        <w:t>--&gt;  Logic.dll  --</w:t>
+        <w:t xml:space="preserve">--&gt;  </w:t>
+      </w:r>
+      <w:r>
+        <w:rPr>
+          <w:rFonts w:ascii="Consolas" w:hAnsi="Consolas"/>
+          <w:noProof/>
+          <w:color w:val="000000" w:themeColor="text1"/>
+          <w:sz w:val="18"/>
+          <w:szCs w:val="18"/>
+          <w:lang w:val="en-MY"/>
+        </w:rPr>
+        <w:t xml:space="preserve">XenAnalyticModel.dll </w:t>
+      </w:r>
+      <w:r>
+        <w:rPr>
+          <w:rFonts w:ascii="Consolas" w:hAnsi="Consolas"/>
+          <w:noProof/>
+          <w:color w:val="000000" w:themeColor="text1"/>
+          <w:sz w:val="18"/>
+          <w:szCs w:val="18"/>
+          <w:lang w:val="en-MY"/>
+        </w:rPr>
+        <w:t xml:space="preserve">  --</w:t>
       </w:r>
       <w:r>
         <w:rPr>
@@ -5550,7 +5609,18 @@
           <w:szCs w:val="18"/>
           <w:lang w:val="en-MY"/>
         </w:rPr>
-        <w:t>depends on--&gt;  Model.dll</w:t>
+        <w:t xml:space="preserve">depends on--&gt;  </w:t>
+      </w:r>
+      <w:r>
+        <w:rPr>
+          <w:rFonts w:ascii="Consolas" w:hAnsi="Consolas"/>
+          <w:noProof/>
+          <w:color w:val="000000" w:themeColor="text1"/>
+          <w:sz w:val="18"/>
+          <w:szCs w:val="18"/>
+          <w:lang w:val="en-MY"/>
+        </w:rPr>
+        <w:t xml:space="preserve">XenAnalyticDevice.dll </w:t>
       </w:r>
     </w:p>
     <w:p>
@@ -5689,7 +5759,97 @@
           <w:sz w:val="22"/>
           <w:lang w:val="en-MY"/>
         </w:rPr>
-        <w:t>Reference Logic.dll only; Model.dll is pulled in automatically as a transitive dependency. Model.dll has no knowledge of quota allocation or of the output tables. Only three classes in Logic.dll reach across into Model.dll at all: DevicePipeline, DevicePipelineResult and DevicePipelineCallbacks.</w:t>
+        <w:t xml:space="preserve">Reference </w:t>
+      </w:r>
+      <w:r>
+        <w:rPr>
+          <w:noProof/>
+          <w:color w:val="000000" w:themeColor="text1"/>
+          <w:sz w:val="22"/>
+          <w:lang w:val="en-MY"/>
+        </w:rPr>
+        <w:t xml:space="preserve">XenAnalyticModel.dll </w:t>
+      </w:r>
+      <w:r>
+        <w:rPr>
+          <w:noProof/>
+          <w:color w:val="000000" w:themeColor="text1"/>
+          <w:sz w:val="22"/>
+          <w:lang w:val="en-MY"/>
+        </w:rPr>
+        <w:t xml:space="preserve"> only; </w:t>
+      </w:r>
+      <w:r>
+        <w:rPr>
+          <w:noProof/>
+          <w:color w:val="000000" w:themeColor="text1"/>
+          <w:sz w:val="22"/>
+          <w:lang w:val="en-MY"/>
+        </w:rPr>
+        <w:t xml:space="preserve">XenAnalyticDevice.dll </w:t>
+      </w:r>
+      <w:r>
+        <w:rPr>
+          <w:noProof/>
+          <w:color w:val="000000" w:themeColor="text1"/>
+          <w:sz w:val="22"/>
+          <w:lang w:val="en-MY"/>
+        </w:rPr>
+        <w:t xml:space="preserve"> is pulled in automatically as a transitive dependency. </w:t>
+      </w:r>
+      <w:r>
+        <w:rPr>
+          <w:noProof/>
+          <w:color w:val="000000" w:themeColor="text1"/>
+          <w:sz w:val="22"/>
+          <w:lang w:val="en-MY"/>
+        </w:rPr>
+        <w:t xml:space="preserve">XenAnalyticDevice.dll </w:t>
+      </w:r>
+      <w:r>
+        <w:rPr>
+          <w:noProof/>
+          <w:color w:val="000000" w:themeColor="text1"/>
+          <w:sz w:val="22"/>
+          <w:lang w:val="en-MY"/>
+        </w:rPr>
+        <w:t xml:space="preserve"> has no knowledge of quota allocation or of the output tables. Only three classes in </w:t>
+      </w:r>
+      <w:r>
+        <w:rPr>
+          <w:noProof/>
+          <w:color w:val="000000" w:themeColor="text1"/>
+          <w:sz w:val="22"/>
+          <w:lang w:val="en-MY"/>
+        </w:rPr>
+        <w:t xml:space="preserve">XenAnalyticModel.dll </w:t>
+      </w:r>
+      <w:r>
+        <w:rPr>
+          <w:noProof/>
+          <w:color w:val="000000" w:themeColor="text1"/>
+          <w:sz w:val="22"/>
+          <w:lang w:val="en-MY"/>
+        </w:rPr>
+        <w:t xml:space="preserve"> reach across into </w:t>
+      </w:r>
+      <w:r>
+        <w:rPr>
+          <w:noProof/>
+          <w:color w:val="000000" w:themeColor="text1"/>
+          <w:sz w:val="22"/>
+          <w:lang w:val="en-MY"/>
+        </w:rPr>
+        <w:t xml:space="preserve">XenAnalyticDevice.dll </w:t>
+      </w:r>
+      <w:r>
+        <w:rPr>
+          <w:noProof/>
+          <w:color w:val="000000" w:themeColor="text1"/>
+          <w:sz w:val="22"/>
+          <w:lang w:val="en-MY"/>
+        </w:rPr>
+        <w:t xml:space="preserve"> at all: DevicePipeline, DevicePipelineResult and DevicePipelineCallbacks.</w:t>
       </w:r>
     </w:p>
     <w:p>
@@ -5924,7 +6084,7 @@
                 <w:szCs w:val="18"/>
                 <w:lang w:val="en-MY"/>
               </w:rPr>
-              <w:t>Model.dll</w:t>
+              <w:t xml:space="preserve">XenAnalyticDevice.dll </w:t>
             </w:r>
           </w:p>
         </w:tc>
@@ -6008,7 +6168,17 @@
                 <w:szCs w:val="18"/>
                 <w:lang w:val="en-MY"/>
               </w:rPr>
-              <w:t>Model.dll to Python</w:t>
+              <w:t xml:space="preserve">XenAnalyticDevice.dll </w:t>
+            </w:r>
+            <w:r>
+              <w:rPr>
+                <w:noProof/>
+                <w:color w:val="000000" w:themeColor="text1"/>
+                <w:sz w:val="18"/>
+                <w:szCs w:val="18"/>
+                <w:lang w:val="en-MY"/>
+              </w:rPr>
+              <w:t xml:space="preserve"> to Python</w:t>
             </w:r>
           </w:p>
         </w:tc>
@@ -6092,7 +6262,17 @@
                 <w:szCs w:val="18"/>
                 <w:lang w:val="en-MY"/>
               </w:rPr>
-              <w:t>Model.dll to Python</w:t>
+              <w:t xml:space="preserve">XenAnalyticDevice.dll </w:t>
+            </w:r>
+            <w:r>
+              <w:rPr>
+                <w:noProof/>
+                <w:color w:val="000000" w:themeColor="text1"/>
+                <w:sz w:val="18"/>
+                <w:szCs w:val="18"/>
+                <w:lang w:val="en-MY"/>
+              </w:rPr>
+              <w:t xml:space="preserve"> to Python</w:t>
             </w:r>
           </w:p>
         </w:tc>
@@ -6176,7 +6356,7 @@
                 <w:szCs w:val="18"/>
                 <w:lang w:val="en-MY"/>
               </w:rPr>
-              <w:t>Logic.dll</w:t>
+              <w:t xml:space="preserve">XenAnalyticModel.dll </w:t>
             </w:r>
           </w:p>
         </w:tc>
@@ -6260,7 +6440,7 @@
                 <w:szCs w:val="18"/>
                 <w:lang w:val="en-MY"/>
               </w:rPr>
-              <w:t>Logic.dll</w:t>
+              <w:t xml:space="preserve">XenAnalyticModel.dll </w:t>
             </w:r>
           </w:p>
         </w:tc>
@@ -6344,7 +6524,7 @@
                 <w:szCs w:val="18"/>
                 <w:lang w:val="en-MY"/>
               </w:rPr>
-              <w:t>Logic.dll</w:t>
+              <w:t xml:space="preserve">XenAnalyticModel.dll </w:t>
             </w:r>
           </w:p>
         </w:tc>
@@ -6428,7 +6608,7 @@
                 <w:szCs w:val="18"/>
                 <w:lang w:val="en-MY"/>
               </w:rPr>
-              <w:t>Logic.dll</w:t>
+              <w:t xml:space="preserve">XenAnalyticModel.dll </w:t>
             </w:r>
           </w:p>
         </w:tc>
@@ -8676,7 +8856,7 @@
                 <w:szCs w:val="18"/>
                 <w:lang w:val="en-MY"/>
               </w:rPr>
-              <w:t>Logic.dll</w:t>
+              <w:t xml:space="preserve">XenAnalyticModel.dll </w:t>
             </w:r>
           </w:p>
         </w:tc>
@@ -8766,7 +8946,7 @@
                 <w:szCs w:val="18"/>
                 <w:lang w:val="en-MY"/>
               </w:rPr>
-              <w:t>Logic.dll</w:t>
+              <w:t xml:space="preserve">XenAnalyticModel.dll </w:t>
             </w:r>
           </w:p>
         </w:tc>
@@ -8853,7 +9033,7 @@
                 <w:szCs w:val="18"/>
                 <w:lang w:val="en-MY"/>
               </w:rPr>
-              <w:t>Logic.dll</w:t>
+              <w:t xml:space="preserve">XenAnalyticModel.dll </w:t>
             </w:r>
           </w:p>
         </w:tc>
@@ -8940,7 +9120,7 @@
                 <w:szCs w:val="18"/>
                 <w:lang w:val="en-MY"/>
               </w:rPr>
-              <w:t>Model.dll</w:t>
+              <w:t xml:space="preserve">XenAnalyticDevice.dll </w:t>
             </w:r>
           </w:p>
         </w:tc>
@@ -9027,7 +9207,7 @@
                 <w:szCs w:val="18"/>
                 <w:lang w:val="en-MY"/>
               </w:rPr>
-              <w:t>Model.dll</w:t>
+              <w:t xml:space="preserve">XenAnalyticDevice.dll </w:t>
             </w:r>
           </w:p>
         </w:tc>
@@ -9114,7 +9294,7 @@
                 <w:szCs w:val="18"/>
                 <w:lang w:val="en-MY"/>
               </w:rPr>
-              <w:t>Model.dll</w:t>
+              <w:t xml:space="preserve">XenAnalyticDevice.dll </w:t>
             </w:r>
           </w:p>
         </w:tc>
@@ -9201,7 +9381,7 @@
                 <w:szCs w:val="18"/>
                 <w:lang w:val="en-MY"/>
               </w:rPr>
-              <w:t>Model.dll</w:t>
+              <w:t xml:space="preserve">XenAnalyticDevice.dll </w:t>
             </w:r>
           </w:p>
         </w:tc>
@@ -9294,7 +9474,7 @@
                 <w:szCs w:val="18"/>
                 <w:lang w:val="en-MY"/>
               </w:rPr>
-              <w:t>Model.dll</w:t>
+              <w:t xml:space="preserve">XenAnalyticDevice.dll </w:t>
             </w:r>
           </w:p>
         </w:tc>
@@ -9956,7 +10136,18 @@
           <w:szCs w:val="16"/>
           <w:lang w:val="en-MY"/>
         </w:rPr>
-        <w:t xml:space="preserve">    Logic.dll</w:t>
+        <w:t xml:space="preserve">    </w:t>
+      </w:r>
+      <w:r>
+        <w:rPr>
+          <w:rFonts w:ascii="Consolas" w:hAnsi="Consolas"/>
+          <w:noProof/>
+          <w:color w:val="000000" w:themeColor="text1"/>
+          <w:sz w:val="16"/>
+          <w:szCs w:val="16"/>
+          <w:lang w:val="en-MY"/>
+        </w:rPr>
+        <w:t xml:space="preserve">XenAnalyticModel.dll </w:t>
       </w:r>
     </w:p>
     <w:p>
@@ -9982,7 +10173,18 @@
           <w:szCs w:val="16"/>
           <w:lang w:val="en-MY"/>
         </w:rPr>
-        <w:t xml:space="preserve">    Model.dll</w:t>
+        <w:t xml:space="preserve">    </w:t>
+      </w:r>
+      <w:r>
+        <w:rPr>
+          <w:rFonts w:ascii="Consolas" w:hAnsi="Consolas"/>
+          <w:noProof/>
+          <w:color w:val="000000" w:themeColor="text1"/>
+          <w:sz w:val="16"/>
+          <w:szCs w:val="16"/>
+          <w:lang w:val="en-MY"/>
+        </w:rPr>
+        <w:t xml:space="preserve">XenAnalyticDevice.dll </w:t>
       </w:r>
     </w:p>
     <w:p>
@@ -12671,7 +12873,17 @@
           <w:sz w:val="18"/>
           <w:lang w:val="en-MY"/>
         </w:rPr>
-        <w:t>UI--&gt;  references --&gt; Logic.dll</w:t>
+        <w:t xml:space="preserve">UI--&gt;  references --&gt; </w:t>
+      </w:r>
+      <w:r>
+        <w:rPr>
+          <w:rFonts w:ascii="Consolas" w:hAnsi="Consolas"/>
+          <w:noProof/>
+          <w:color w:val="000000" w:themeColor="text1"/>
+          <w:sz w:val="18"/>
+          <w:lang w:val="en-MY"/>
+        </w:rPr>
+        <w:t xml:space="preserve">XenAnalyticModel.dll </w:t>
       </w:r>
     </w:p>
     <w:p>
@@ -12767,7 +12979,17 @@
           <w:sz w:val="18"/>
           <w:lang w:val="en-MY"/>
         </w:rPr>
-        <w:t xml:space="preserve">                     Model.dll</w:t>
+        <w:t xml:space="preserve">                     </w:t>
+      </w:r>
+      <w:r>
+        <w:rPr>
+          <w:rFonts w:ascii="Consolas" w:hAnsi="Consolas"/>
+          <w:noProof/>
+          <w:color w:val="000000" w:themeColor="text1"/>
+          <w:sz w:val="18"/>
+          <w:lang w:val="en-MY"/>
+        </w:rPr>
+        <w:t xml:space="preserve">XenAnalyticDevice.dll </w:t>
       </w:r>
     </w:p>
     <w:p>
@@ -12987,7 +13209,7 @@
                 <w:noProof/>
                 <w:lang w:val="en-MY"/>
               </w:rPr>
-              <w:t>Logic.dll</w:t>
+              <w:t xml:space="preserve">XenAnalyticModel.dll </w:t>
             </w:r>
           </w:p>
         </w:tc>
@@ -13043,7 +13265,7 @@
                 <w:noProof/>
                 <w:lang w:val="en-MY"/>
               </w:rPr>
-              <w:t>Model.dll</w:t>
+              <w:t xml:space="preserve">XenAnalyticDevice.dll </w:t>
             </w:r>
           </w:p>
         </w:tc>
@@ -13092,7 +13314,7 @@
           <w:noProof/>
           <w:lang w:val="en-MY"/>
         </w:rPr>
-        <w:t>Logic.dll</w:t>
+        <w:t xml:space="preserve">XenAnalyticModel.dll </w:t>
       </w:r>
       <w:r>
         <w:rPr>
@@ -13110,7 +13332,7 @@
           <w:noProof/>
           <w:lang w:val="en-MY"/>
         </w:rPr>
-        <w:t>Model.dll</w:t>
+        <w:t xml:space="preserve">XenAnalyticDevice.dll </w:t>
       </w:r>
       <w:r>
         <w:rPr>
@@ -13118,7 +13340,39 @@
           <w:noProof/>
           <w:lang w:val="en-MY"/>
         </w:rPr>
-        <w:t>, while Model.dll does not depend on Logic.dll. Most of the system flow is coordinated by DevicePipeline</w:t>
+        <w:t xml:space="preserve">, while </w:t>
+      </w:r>
+      <w:r>
+        <w:rPr>
+          <w:rFonts w:asciiTheme="majorHAnsi" w:hAnsiTheme="majorHAnsi" w:cstheme="majorHAnsi"/>
+          <w:noProof/>
+          <w:lang w:val="en-MY"/>
+        </w:rPr>
+        <w:t xml:space="preserve">XenAnalyticDevice.dll </w:t>
+      </w:r>
+      <w:r>
+        <w:rPr>
+          <w:rFonts w:asciiTheme="majorHAnsi" w:hAnsiTheme="majorHAnsi" w:cstheme="majorHAnsi"/>
+          <w:noProof/>
+          <w:lang w:val="en-MY"/>
+        </w:rPr>
+        <w:t xml:space="preserve"> does not depend on </w:t>
+      </w:r>
+      <w:r>
+        <w:rPr>
+          <w:rFonts w:asciiTheme="majorHAnsi" w:hAnsiTheme="majorHAnsi" w:cstheme="majorHAnsi"/>
+          <w:noProof/>
+          <w:lang w:val="en-MY"/>
+        </w:rPr>
+        <w:t xml:space="preserve">XenAnalyticModel.dll </w:t>
+      </w:r>
+      <w:r>
+        <w:rPr>
+          <w:rFonts w:asciiTheme="majorHAnsi" w:hAnsiTheme="majorHAnsi" w:cstheme="majorHAnsi"/>
+          <w:noProof/>
+          <w:lang w:val="en-MY"/>
+        </w:rPr>
+        <w:t>. Most of the system flow is coordinated by DevicePipeline</w:t>
       </w:r>
     </w:p>
     <w:p>
@@ -13182,7 +13436,17 @@
           <w:sz w:val="22"/>
           <w:lang w:val="en-MY"/>
         </w:rPr>
-        <w:t xml:space="preserve">Logic.dll : </w:t>
+        <w:t xml:space="preserve">XenAnalyticModel.dll </w:t>
+      </w:r>
+      <w:r>
+        <w:rPr>
+          <w:b/>
+          <w:bCs/>
+          <w:noProof/>
+          <w:sz w:val="22"/>
+          <w:lang w:val="en-MY"/>
+        </w:rPr>
+        <w:t xml:space="preserve"> : </w:t>
       </w:r>
     </w:p>
     <w:tbl>
@@ -13239,7 +13503,18 @@
                 <w:szCs w:val="18"/>
                 <w:lang w:val="en-MY"/>
               </w:rPr>
-              <w:t>Logic.dll  Class</w:t>
+              <w:t xml:space="preserve">XenAnalyticModel.dll </w:t>
+            </w:r>
+            <w:r>
+              <w:rPr>
+                <w:b/>
+                <w:bCs/>
+                <w:noProof/>
+                <w:sz w:val="18"/>
+                <w:szCs w:val="18"/>
+                <w:lang w:val="en-MY"/>
+              </w:rPr>
+              <w:t xml:space="preserve">  Class</w:t>
             </w:r>
           </w:p>
         </w:tc>
@@ -13893,7 +14168,24 @@
           <w:color w:val="000000" w:themeColor="text1"/>
           <w:lang w:val="en-MY"/>
         </w:rPr>
-        <w:t>The remaining classes in Logic.dll are primarily result or data structures used by these components.</w:t>
+        <w:lastRenderedPageBreak/>
+        <w:t xml:space="preserve">The remaining classes in </w:t>
+      </w:r>
+      <w:r>
+        <w:rPr>
+          <w:noProof/>
+          <w:color w:val="000000" w:themeColor="text1"/>
+          <w:lang w:val="en-MY"/>
+        </w:rPr>
+        <w:t xml:space="preserve">XenAnalyticModel.dll </w:t>
+      </w:r>
+      <w:r>
+        <w:rPr>
+          <w:noProof/>
+          <w:color w:val="000000" w:themeColor="text1"/>
+          <w:lang w:val="en-MY"/>
+        </w:rPr>
+        <w:t xml:space="preserve"> are primarily result or data structures used by these components.</w:t>
       </w:r>
     </w:p>
     <w:p>
@@ -13916,8 +14208,18 @@
           <w:sz w:val="22"/>
           <w:lang w:val="en-MY"/>
         </w:rPr>
-        <w:lastRenderedPageBreak/>
-        <w:t xml:space="preserve">Model.dll : </w:t>
+        <w:t xml:space="preserve">XenAnalyticDevice.dll </w:t>
+      </w:r>
+      <w:r>
+        <w:rPr>
+          <w:b/>
+          <w:bCs/>
+          <w:noProof/>
+          <w:color w:val="000000" w:themeColor="text1"/>
+          <w:sz w:val="22"/>
+          <w:lang w:val="en-MY"/>
+        </w:rPr>
+        <w:t xml:space="preserve"> : </w:t>
       </w:r>
     </w:p>
     <w:tbl>
@@ -13975,7 +14277,18 @@
                 <w:szCs w:val="18"/>
                 <w:lang w:val="en-MY"/>
               </w:rPr>
-              <w:t xml:space="preserve">Model.dll </w:t>
+              <w:t xml:space="preserve">XenAnalyticDevice.dll </w:t>
+            </w:r>
+            <w:r>
+              <w:rPr>
+                <w:b/>
+                <w:bCs/>
+                <w:noProof/>
+                <w:sz w:val="18"/>
+                <w:szCs w:val="18"/>
+                <w:lang w:val="en-MY"/>
+              </w:rPr>
+              <w:t xml:space="preserve"> </w:t>
             </w:r>
             <w:r>
               <w:rPr>
@@ -15164,7 +15477,6 @@
           <w:color w:val="000000" w:themeColor="text1"/>
           <w:lang w:val="en-MY"/>
         </w:rPr>
-        <w:lastRenderedPageBreak/>
         <w:t xml:space="preserve">4.4 </w:t>
       </w:r>
       <w:r>
@@ -15744,7 +16056,79 @@
           <w:sz w:val="22"/>
           <w:lang w:val="en-MY"/>
         </w:rPr>
-        <w:t>The main dependency direction is one-way. Logic.dll depends on Model.dll, while Model.dll does not depend on Logic.dll.</w:t>
+        <w:t xml:space="preserve">The main dependency direction is one-way. </w:t>
+      </w:r>
+      <w:r>
+        <w:rPr>
+          <w:noProof/>
+          <w:color w:val="000000" w:themeColor="text1"/>
+          <w:sz w:val="22"/>
+          <w:lang w:val="en-MY"/>
+        </w:rPr>
+        <w:t xml:space="preserve">XenAnalyticModel.dll </w:t>
+      </w:r>
+      <w:r>
+        <w:rPr>
+          <w:noProof/>
+          <w:color w:val="000000" w:themeColor="text1"/>
+          <w:sz w:val="22"/>
+          <w:lang w:val="en-MY"/>
+        </w:rPr>
+        <w:t xml:space="preserve"> depends on </w:t>
+      </w:r>
+      <w:r>
+        <w:rPr>
+          <w:noProof/>
+          <w:color w:val="000000" w:themeColor="text1"/>
+          <w:sz w:val="22"/>
+          <w:lang w:val="en-MY"/>
+        </w:rPr>
+        <w:t xml:space="preserve">XenAnalyticDevice.dll </w:t>
+      </w:r>
+      <w:r>
+        <w:rPr>
+          <w:noProof/>
+          <w:color w:val="000000" w:themeColor="text1"/>
+          <w:sz w:val="22"/>
+          <w:lang w:val="en-MY"/>
+        </w:rPr>
+        <w:t xml:space="preserve">, while </w:t>
+      </w:r>
+      <w:r>
+        <w:rPr>
+          <w:noProof/>
+          <w:color w:val="000000" w:themeColor="text1"/>
+          <w:sz w:val="22"/>
+          <w:lang w:val="en-MY"/>
+        </w:rPr>
+        <w:t xml:space="preserve">XenAnalyticDevice.dll </w:t>
+      </w:r>
+      <w:r>
+        <w:rPr>
+          <w:noProof/>
+          <w:color w:val="000000" w:themeColor="text1"/>
+          <w:sz w:val="22"/>
+          <w:lang w:val="en-MY"/>
+        </w:rPr>
+        <w:t xml:space="preserve"> does not depend on </w:t>
+      </w:r>
+      <w:r>
+        <w:rPr>
+          <w:noProof/>
+          <w:color w:val="000000" w:themeColor="text1"/>
+          <w:sz w:val="22"/>
+          <w:lang w:val="en-MY"/>
+        </w:rPr>
+        <w:t xml:space="preserve">XenAnalyticModel.dll </w:t>
+      </w:r>
+      <w:r>
+        <w:rPr>
+          <w:noProof/>
+          <w:color w:val="000000" w:themeColor="text1"/>
+          <w:sz w:val="22"/>
+          <w:lang w:val="en-MY"/>
+        </w:rPr>
+        <w:t>.</w:t>
       </w:r>
     </w:p>
     <w:p>
@@ -15787,7 +16171,51 @@
           <w:highlight w:val="lightGray"/>
           <w:lang w:val="en-MY"/>
         </w:rPr>
-        <w:t>UI  →  Logic.dll  →  Model.dll  →  SQL Server / Python Prediction</w:t>
+        <w:t xml:space="preserve">UI  →  </w:t>
+      </w:r>
+      <w:r>
+        <w:rPr>
+          <w:rFonts w:ascii="Consolas" w:hAnsi="Consolas"/>
+          <w:noProof/>
+          <w:color w:val="000000" w:themeColor="text1"/>
+          <w:sz w:val="22"/>
+          <w:highlight w:val="lightGray"/>
+          <w:lang w:val="en-MY"/>
+        </w:rPr>
+        <w:t xml:space="preserve">XenAnalyticModel.dll </w:t>
+      </w:r>
+      <w:r>
+        <w:rPr>
+          <w:rFonts w:ascii="Consolas" w:hAnsi="Consolas"/>
+          <w:noProof/>
+          <w:color w:val="000000" w:themeColor="text1"/>
+          <w:sz w:val="22"/>
+          <w:highlight w:val="lightGray"/>
+          <w:lang w:val="en-MY"/>
+        </w:rPr>
+        <w:t xml:space="preserve">  →  </w:t>
+      </w:r>
+      <w:r>
+        <w:rPr>
+          <w:rFonts w:ascii="Consolas" w:hAnsi="Consolas"/>
+          <w:noProof/>
+          <w:color w:val="000000" w:themeColor="text1"/>
+          <w:sz w:val="22"/>
+          <w:highlight w:val="lightGray"/>
+          <w:lang w:val="en-MY"/>
+        </w:rPr>
+        <w:t xml:space="preserve">XenAnalyticDevice.dll </w:t>
+      </w:r>
+      <w:r>
+        <w:rPr>
+          <w:rFonts w:ascii="Consolas" w:hAnsi="Consolas"/>
+          <w:noProof/>
+          <w:color w:val="000000" w:themeColor="text1"/>
+          <w:sz w:val="22"/>
+          <w:highlight w:val="lightGray"/>
+          <w:lang w:val="en-MY"/>
+        </w:rPr>
+        <w:t xml:space="preserve">  →  SQL Server / Python Prediction</w:t>
       </w:r>
     </w:p>
     <w:p>
@@ -15977,7 +16405,7 @@
                 <w:sz w:val="18"/>
                 <w:lang w:val="en-MY"/>
               </w:rPr>
-              <w:t>Logic.dll</w:t>
+              <w:t xml:space="preserve">XenAnalyticModel.dll </w:t>
             </w:r>
           </w:p>
         </w:tc>
@@ -16055,7 +16483,7 @@
                 <w:sz w:val="18"/>
                 <w:lang w:val="en-MY"/>
               </w:rPr>
-              <w:t>Logic.dll</w:t>
+              <w:t xml:space="preserve">XenAnalyticModel.dll </w:t>
             </w:r>
           </w:p>
         </w:tc>
@@ -16130,7 +16558,7 @@
                 <w:sz w:val="18"/>
                 <w:lang w:val="en-MY"/>
               </w:rPr>
-              <w:t>Logic.dll</w:t>
+              <w:t xml:space="preserve">XenAnalyticModel.dll </w:t>
             </w:r>
           </w:p>
         </w:tc>
@@ -16205,7 +16633,7 @@
                 <w:sz w:val="18"/>
                 <w:lang w:val="en-MY"/>
               </w:rPr>
-              <w:t>Logic.dll</w:t>
+              <w:t xml:space="preserve">XenAnalyticModel.dll </w:t>
             </w:r>
           </w:p>
         </w:tc>
@@ -16280,7 +16708,7 @@
                 <w:sz w:val="18"/>
                 <w:lang w:val="en-MY"/>
               </w:rPr>
-              <w:t>Logic.dll</w:t>
+              <w:t xml:space="preserve">XenAnalyticModel.dll </w:t>
             </w:r>
           </w:p>
         </w:tc>
@@ -16355,7 +16783,7 @@
                 <w:sz w:val="18"/>
                 <w:lang w:val="en-MY"/>
               </w:rPr>
-              <w:t>Model.dll</w:t>
+              <w:t xml:space="preserve">XenAnalyticDevice.dll </w:t>
             </w:r>
           </w:p>
         </w:tc>
@@ -16430,7 +16858,7 @@
                 <w:sz w:val="18"/>
                 <w:lang w:val="en-MY"/>
               </w:rPr>
-              <w:t>Model.dll</w:t>
+              <w:t xml:space="preserve">XenAnalyticDevice.dll </w:t>
             </w:r>
           </w:p>
         </w:tc>
@@ -16505,7 +16933,7 @@
                 <w:sz w:val="18"/>
                 <w:lang w:val="en-MY"/>
               </w:rPr>
-              <w:t>Model.dll</w:t>
+              <w:t xml:space="preserve">XenAnalyticDevice.dll </w:t>
             </w:r>
           </w:p>
         </w:tc>
@@ -16586,7 +17014,7 @@
                 <w:sz w:val="18"/>
                 <w:lang w:val="en-MY"/>
               </w:rPr>
-              <w:t>Model.dll</w:t>
+              <w:t xml:space="preserve">XenAnalyticDevice.dll </w:t>
             </w:r>
           </w:p>
         </w:tc>
@@ -16637,6 +17065,7 @@
           <w:highlight w:val="lightGray"/>
           <w:lang w:val="en-MY"/>
         </w:rPr>
+        <w:lastRenderedPageBreak/>
         <w:t>DevicePipeline</w:t>
       </w:r>
       <w:r>

</xml_diff>